<commit_message>
Update India VDR Sept 2026: remove background info, add DCC dissolution
Co-Authored-By: Claude Opus 5.5 <noreply@anthropic.com>
Claude-Session: https://claude.ai/code/session_01Kn2WARNo7K7k12QYTPEKnR
</commit_message>
<xml_diff>
--- a/INDIA_VDR_SEPTEMBER_2026.docx
+++ b/INDIA_VDR_SEPTEMBER_2026.docx
@@ -504,7 +504,7 @@
           <w:sz w:val="18"/>
           <w:szCs w:val="18"/>
         </w:rPr>
-        <w:t xml:space="preserve">Satcom Spectrum Framework Cleared and New Voice-Only Tariff Obligations</w:t>
+        <w:t xml:space="preserve">Telecom Governance Reform, Satcom Spectrum Framework and New Voice-Only Tariff Obligations</w:t>
       </w:r>
     </w:p>
     <w:p>
@@ -522,7 +522,7 @@
           <w:sz w:val="18"/>
           <w:szCs w:val="18"/>
         </w:rPr>
-        <w:t xml:space="preserve">The Digital Communications Commission (DoT) approved most TRAI recommendations on satellite spectrum (5% SUC, administrative assignment), and TRAI notified the Telecom Consumer Protection (Thirteenth Amendment) Regulations, 2026, mandating shorter-validity voice-and-SMS-only vouchers.</w:t>
+        <w:t xml:space="preserve">The Union Cabinet approved the dissolution of the 37-year-old Digital Communications Commission (16 September 2026), shortly after the DCC approved most TRAI recommendations on satellite spectrum (5% SUC, administrative assignment). TRAI notified the Telecom Consumer Protection (Thirteenth Amendment) Regulations, 2026, mandating shorter-validity voice-and-SMS-only vouchers.</w:t>
       </w:r>
     </w:p>
     <w:tbl>
@@ -994,13 +994,17 @@
             </w:pPr>
             <w:r>
               <w:rPr>
-                <w:sz w:val="18"/>
-                <w:szCs w:val="18"/>
-              </w:rPr>
-              <w:sym w:font="Wingdings" w:char="F070"/>
-            </w:r>
-            <w:r>
-              <w:rPr>
+                <w:b/>
+                <w:bCs/>
+                <w:sz w:val="18"/>
+                <w:szCs w:val="18"/>
+              </w:rPr>
+              <w:sym w:font="Wingdings" w:char="F0FE"/>
+            </w:r>
+            <w:r>
+              <w:rPr>
+                <w:b/>
+                <w:bCs/>
                 <w:sz w:val="18"/>
                 <w:szCs w:val="18"/>
               </w:rPr>
@@ -1200,7 +1204,7 @@
                 <w:sz w:val="18"/>
                 <w:szCs w:val="18"/>
               </w:rPr>
-              <w:t xml:space="preserve">Microsoft formally launched its fourth India cloud region, India South Central (Hyderabad), on 21 September 2026. The launch is part of its USD 20.5 billion India commitment. The region supports advanced AI workloads with zero-water cooling and joins the Pune, Chennai and Mumbai regions. Early customers include Adani Group, Bajaj Finserv and HDFC Bank.</w:t>
+              <w:t xml:space="preserve">On 16 September 2026 the Union Cabinet approved the dissolution of the Digital Communications Commission (DCC), the 37-year-old apex inter-ministerial decision-making body of DoT (set up in 1989 as the Telecom Commission and renamed DCC in 2018). The dissolution took effect through a government resolution dated 19 September 2026. Final policy and administrative decisions in DoT now rest with the Telecom Secretary, with the Communications Minister and the Cabinet involved where required.</w:t>
             </w:r>
           </w:p>
           <w:p>
@@ -1226,7 +1230,7 @@
                 <w:sz w:val="18"/>
                 <w:szCs w:val="18"/>
               </w:rPr>
-              <w:t xml:space="preserve">HyperVault (a TCS subsidiary) secured 264 acres in Hyderabad, Telangana, for a large-scale AI data centre campus of up to 1 GW. The campus is built for high-density GPU deployments for hyperscalers and frontier AI companies, and will use green energy and a water-neutral design.</w:t>
+              <w:t xml:space="preserve">Microsoft formally launched its fourth India cloud region, India South Central (Hyderabad), on 21 September 2026. The launch is part of its USD 20.5 billion India commitment. The region supports advanced AI workloads with zero-water cooling and joins the Pune, Chennai and Mumbai regions. Early customers include Adani Group, Bajaj Finserv and HDFC Bank.</w:t>
             </w:r>
           </w:p>
           <w:p>
@@ -1252,6 +1256,32 @@
                 <w:sz w:val="18"/>
                 <w:szCs w:val="18"/>
               </w:rPr>
+              <w:t xml:space="preserve">HyperVault (a TCS subsidiary) secured 264 acres in Hyderabad, Telangana, for a large-scale AI data centre campus of up to 1 GW. The campus is built for high-density GPU deployments for hyperscalers and frontier AI companies, and will use green energy and a water-neutral design.</w:t>
+            </w:r>
+          </w:p>
+          <w:p>
+            <w:pPr>
+              <w:pStyle w:val="ListParagraph"/>
+              <w:numPr>
+                <w:ilvl w:val="0"/>
+                <w:numId w:val="4"/>
+              </w:numPr>
+              <w:spacing w:after="0" w:line="240" w:lineRule="auto"/>
+              <w:ind w:left="216" w:hanging="216"/>
+              <w:rPr>
+                <w:b/>
+                <w:bCs/>
+                <w:sz w:val="18"/>
+                <w:szCs w:val="18"/>
+              </w:rPr>
+            </w:pPr>
+            <w:r>
+              <w:rPr>
+                <w:b/>
+                <w:bCs/>
+                <w:sz w:val="18"/>
+                <w:szCs w:val="18"/>
+              </w:rPr>
               <w:t xml:space="preserve">Industry reports for H1 2026 show that India’s top seven data centre markets added about 178 MW, taking operational capacity to about 1.8 GW. Hyperscale and AI pre-commitments drove about 82% of absorption, which strengthens India’s position as a regional cloud and interconnection hub.</w:t>
             </w:r>
           </w:p>
@@ -1497,6 +1527,27 @@
               </w:rPr>
             </w:pPr>
             <w:hyperlink r:id="rId101" w:history="1">
+              <w:r>
+                <w:rPr>
+                  <w:rStyle w:val="Hyperlink"/>
+                  <w:color w:val="0563C1"/>
+                  <w:u w:val="single"/>
+                  <w:sz w:val="18"/>
+                  <w:szCs w:val="18"/>
+                </w:rPr>
+                <w:t xml:space="preserve">https://www.deccanchronicle.com/amp/nation/new-delhi-cabinet-approves-dissolution-of-37-year-old-telecom-apex-body-dcc-1987937</w:t>
+              </w:r>
+            </w:hyperlink>
+          </w:p>
+          <w:p>
+            <w:pPr>
+              <w:spacing w:after="0" w:line="240" w:lineRule="auto"/>
+              <w:rPr>
+                <w:sz w:val="18"/>
+                <w:szCs w:val="18"/>
+              </w:rPr>
+            </w:pPr>
+            <w:hyperlink r:id="rId102" w:history="1">
               <w:r>
                 <w:rPr>
                   <w:rStyle w:val="Hyperlink"/>
@@ -1517,7 +1568,7 @@
                 <w:szCs w:val="18"/>
               </w:rPr>
             </w:pPr>
-            <w:hyperlink r:id="rId102" w:history="1">
+            <w:hyperlink r:id="rId103" w:history="1">
               <w:r>
                 <w:rPr>
                   <w:rStyle w:val="Hyperlink"/>
@@ -1538,7 +1589,7 @@
                 <w:szCs w:val="18"/>
               </w:rPr>
             </w:pPr>
-            <w:hyperlink r:id="rId103" w:history="1">
+            <w:hyperlink r:id="rId104" w:history="1">
               <w:r>
                 <w:rPr>
                   <w:rStyle w:val="Hyperlink"/>
@@ -1559,7 +1610,7 @@
                 <w:szCs w:val="18"/>
               </w:rPr>
             </w:pPr>
-            <w:hyperlink r:id="rId104" w:history="1">
+            <w:hyperlink r:id="rId105" w:history="1">
               <w:r>
                 <w:rPr>
                   <w:rStyle w:val="Hyperlink"/>
@@ -1857,22 +1908,6 @@
               <w:t xml:space="preserve">“NO UPDATED INFORMATION IS AVAILABLE, INFORMATION IS SAME AS EARLIER”</w:t>
             </w:r>
           </w:p>
-          <w:p>
-            <w:pPr>
-              <w:spacing w:after="0" w:line="240" w:lineRule="auto"/>
-              <w:rPr>
-                <w:sz w:val="18"/>
-                <w:szCs w:val="18"/>
-              </w:rPr>
-            </w:pPr>
-            <w:r>
-              <w:rPr>
-                <w:sz w:val="18"/>
-                <w:szCs w:val="18"/>
-              </w:rPr>
-              <w:t xml:space="preserve">For reference, India follows a Calling Party Pays (CPP) regime. Domestic wireless and wireline call termination is on a Bill and Keep (zero IUC) basis. International incoming termination remains under the TRAI Interconnection Usage Charges framework. No change was notified in September 2026.</w:t>
-            </w:r>
-          </w:p>
         </w:tc>
         <w:tc>
           <w:tcPr>
@@ -2395,22 +2430,2080 @@
               <w:t xml:space="preserve">“UPDATED NUMBERING PLAN IS STILL NOT THERE, INFORMATION IS SAME AS EARLIER”</w:t>
             </w:r>
           </w:p>
-          <w:p>
-            <w:pPr>
-              <w:spacing w:after="0" w:line="240" w:lineRule="auto"/>
-              <w:rPr>
-                <w:sz w:val="18"/>
-                <w:szCs w:val="18"/>
-              </w:rPr>
-            </w:pPr>
-            <w:r>
-              <w:rPr>
-                <w:sz w:val="18"/>
-                <w:szCs w:val="18"/>
-              </w:rPr>
-              <w:t xml:space="preserve">For reference, the number types under the DoT National Numbering Plan are:</w:t>
-            </w:r>
-          </w:p>
+        </w:tc>
+        <w:tc>
+          <w:tcPr>
+            <w:tcW w:w="2349" w:type="dxa"/>
+          </w:tcPr>
+          <w:p>
+            <w:pPr>
+              <w:spacing w:after="0" w:line="240" w:lineRule="auto"/>
+              <w:rPr>
+                <w:sz w:val="18"/>
+                <w:szCs w:val="18"/>
+              </w:rPr>
+            </w:pPr>
+            <w:r>
+              <w:rPr>
+                <w:sz w:val="18"/>
+                <w:szCs w:val="18"/>
+              </w:rPr>
+              <w:sym w:font="Wingdings" w:char="F070"/>
+            </w:r>
+            <w:r>
+              <w:rPr>
+                <w:sz w:val="18"/>
+                <w:szCs w:val="18"/>
+              </w:rPr>
+              <w:t xml:space="preserve">Website</w:t>
+            </w:r>
+          </w:p>
+          <w:p>
+            <w:pPr>
+              <w:spacing w:after="0" w:line="240" w:lineRule="auto"/>
+              <w:rPr>
+                <w:sz w:val="18"/>
+                <w:szCs w:val="18"/>
+              </w:rPr>
+            </w:pPr>
+            <w:r>
+              <w:rPr>
+                <w:sz w:val="18"/>
+                <w:szCs w:val="18"/>
+              </w:rPr>
+              <w:sym w:font="Wingdings" w:char="F070"/>
+            </w:r>
+            <w:r>
+              <w:rPr>
+                <w:sz w:val="18"/>
+                <w:szCs w:val="18"/>
+              </w:rPr>
+              <w:t xml:space="preserve">Regulator/ITU</w:t>
+            </w:r>
+          </w:p>
+          <w:p>
+            <w:pPr>
+              <w:spacing w:after="0" w:line="240" w:lineRule="auto"/>
+              <w:rPr>
+                <w:sz w:val="18"/>
+                <w:szCs w:val="18"/>
+              </w:rPr>
+            </w:pPr>
+            <w:r>
+              <w:rPr>
+                <w:sz w:val="18"/>
+                <w:szCs w:val="18"/>
+              </w:rPr>
+              <w:sym w:font="Wingdings" w:char="F070"/>
+            </w:r>
+            <w:r>
+              <w:rPr>
+                <w:sz w:val="18"/>
+                <w:szCs w:val="18"/>
+              </w:rPr>
+              <w:t xml:space="preserve">Industry Publications</w:t>
+            </w:r>
+          </w:p>
+          <w:p>
+            <w:pPr>
+              <w:spacing w:after="0" w:line="240" w:lineRule="auto"/>
+              <w:rPr>
+                <w:sz w:val="18"/>
+                <w:szCs w:val="18"/>
+              </w:rPr>
+            </w:pPr>
+            <w:r>
+              <w:rPr>
+                <w:sz w:val="18"/>
+                <w:szCs w:val="18"/>
+              </w:rPr>
+              <w:sym w:font="Wingdings" w:char="F070"/>
+            </w:r>
+            <w:r>
+              <w:rPr>
+                <w:sz w:val="18"/>
+                <w:szCs w:val="18"/>
+              </w:rPr>
+              <w:t xml:space="preserve">News Media</w:t>
+            </w:r>
+          </w:p>
+          <w:p>
+            <w:pPr>
+              <w:spacing w:after="0" w:line="240" w:lineRule="auto"/>
+              <w:rPr>
+                <w:sz w:val="18"/>
+                <w:szCs w:val="18"/>
+              </w:rPr>
+            </w:pPr>
+            <w:r>
+              <w:rPr>
+                <w:sz w:val="18"/>
+                <w:szCs w:val="18"/>
+              </w:rPr>
+              <w:sym w:font="Wingdings" w:char="F070"/>
+            </w:r>
+            <w:r>
+              <w:rPr>
+                <w:sz w:val="18"/>
+                <w:szCs w:val="18"/>
+              </w:rPr>
+              <w:t xml:space="preserve">Other Operators</w:t>
+            </w:r>
+          </w:p>
+          <w:p>
+            <w:pPr>
+              <w:spacing w:after="0" w:line="240" w:lineRule="auto"/>
+              <w:rPr>
+                <w:sz w:val="18"/>
+                <w:szCs w:val="18"/>
+              </w:rPr>
+            </w:pPr>
+            <w:r>
+              <w:rPr>
+                <w:sz w:val="18"/>
+                <w:szCs w:val="18"/>
+              </w:rPr>
+              <w:sym w:font="Wingdings" w:char="F070"/>
+            </w:r>
+            <w:r>
+              <w:rPr>
+                <w:sz w:val="18"/>
+                <w:szCs w:val="18"/>
+              </w:rPr>
+              <w:t xml:space="preserve">Online Portals/Databases</w:t>
+            </w:r>
+          </w:p>
+          <w:p>
+            <w:pPr>
+              <w:spacing w:after="0" w:line="240" w:lineRule="auto"/>
+              <w:rPr>
+                <w:sz w:val="18"/>
+                <w:szCs w:val="18"/>
+              </w:rPr>
+            </w:pPr>
+            <w:r>
+              <w:rPr>
+                <w:sz w:val="18"/>
+                <w:szCs w:val="18"/>
+              </w:rPr>
+              <w:sym w:font="Wingdings" w:char="F070"/>
+            </w:r>
+            <w:r>
+              <w:rPr>
+                <w:sz w:val="18"/>
+                <w:szCs w:val="18"/>
+              </w:rPr>
+              <w:t xml:space="preserve">Other source</w:t>
+            </w:r>
+          </w:p>
+        </w:tc>
+        <w:tc>
+          <w:tcPr>
+            <w:tcW w:w="1120" w:type="dxa"/>
+          </w:tcPr>
+          <w:p>
+            <w:pPr>
+              <w:spacing w:after="0" w:line="240" w:lineRule="auto"/>
+              <w:jc w:val="center"/>
+              <w:rPr>
+                <w:b/>
+                <w:bCs/>
+                <w:sz w:val="18"/>
+                <w:szCs w:val="18"/>
+              </w:rPr>
+            </w:pPr>
+            <w:r>
+              <w:rPr>
+                <w:b/>
+                <w:bCs/>
+                <w:sz w:val="18"/>
+                <w:szCs w:val="18"/>
+              </w:rPr>
+              <w:t xml:space="preserve">N/A</w:t>
+            </w:r>
+          </w:p>
+        </w:tc>
+        <w:tc>
+          <w:tcPr>
+            <w:tcW w:w="1691" w:type="dxa"/>
+          </w:tcPr>
+          <w:p>
+            <w:pPr>
+              <w:spacing w:after="0" w:line="240" w:lineRule="auto"/>
+              <w:jc w:val="center"/>
+              <w:rPr>
+                <w:sz w:val="18"/>
+                <w:szCs w:val="18"/>
+              </w:rPr>
+            </w:pPr>
+            <w:r>
+              <w:rPr>
+                <w:sz w:val="18"/>
+                <w:szCs w:val="18"/>
+              </w:rPr>
+              <w:t xml:space="preserve">N/A</w:t>
+            </w:r>
+          </w:p>
+        </w:tc>
+        <w:tc>
+          <w:tcPr>
+            <w:tcW w:w="2270" w:type="dxa"/>
+          </w:tcPr>
+          <w:p>
+            <w:pPr>
+              <w:spacing w:after="0" w:line="240" w:lineRule="auto"/>
+              <w:jc w:val="center"/>
+              <w:rPr>
+                <w:sz w:val="18"/>
+                <w:szCs w:val="18"/>
+              </w:rPr>
+            </w:pPr>
+            <w:r>
+              <w:rPr>
+                <w:sz w:val="18"/>
+                <w:szCs w:val="18"/>
+              </w:rPr>
+              <w:t xml:space="preserve">N/A</w:t>
+            </w:r>
+          </w:p>
+        </w:tc>
+      </w:tr>
+      <w:tr>
+        <w:tc>
+          <w:tcPr>
+            <w:tcW w:w="1364" w:type="dxa"/>
+          </w:tcPr>
+          <w:p>
+            <w:pPr>
+              <w:spacing w:after="0" w:line="240" w:lineRule="auto"/>
+              <w:rPr>
+                <w:sz w:val="18"/>
+                <w:szCs w:val="18"/>
+              </w:rPr>
+            </w:pPr>
+            <w:r>
+              <w:rPr>
+                <w:color w:val="000000"/>
+                <w:sz w:val="18"/>
+                <w:szCs w:val="18"/>
+              </w:rPr>
+              <w:t>Number Porting Obligations</w:t>
+            </w:r>
+          </w:p>
+        </w:tc>
+        <w:tc>
+          <w:tcPr>
+            <w:tcW w:w="2132" w:type="dxa"/>
+          </w:tcPr>
+          <w:p>
+            <w:pPr>
+              <w:spacing w:after="0" w:line="240" w:lineRule="auto"/>
+              <w:rPr>
+                <w:sz w:val="18"/>
+                <w:szCs w:val="18"/>
+              </w:rPr>
+            </w:pPr>
+            <w:r>
+              <w:rPr>
+                <w:sz w:val="18"/>
+                <w:szCs w:val="18"/>
+              </w:rPr>
+              <w:sym w:font="Wingdings" w:char="F070"/>
+            </w:r>
+            <w:r>
+              <w:rPr>
+                <w:sz w:val="18"/>
+                <w:szCs w:val="18"/>
+              </w:rPr>
+              <w:t xml:space="preserve">Consultation Paper</w:t>
+            </w:r>
+          </w:p>
+          <w:p>
+            <w:pPr>
+              <w:spacing w:after="0" w:line="240" w:lineRule="auto"/>
+              <w:rPr>
+                <w:sz w:val="18"/>
+                <w:szCs w:val="18"/>
+              </w:rPr>
+            </w:pPr>
+            <w:r>
+              <w:rPr>
+                <w:sz w:val="18"/>
+                <w:szCs w:val="18"/>
+              </w:rPr>
+              <w:sym w:font="Wingdings" w:char="F070"/>
+            </w:r>
+            <w:r>
+              <w:rPr>
+                <w:sz w:val="18"/>
+                <w:szCs w:val="18"/>
+              </w:rPr>
+              <w:t xml:space="preserve">Initial Talks</w:t>
+            </w:r>
+          </w:p>
+          <w:p>
+            <w:pPr>
+              <w:spacing w:after="0" w:line="240" w:lineRule="auto"/>
+              <w:rPr>
+                <w:sz w:val="18"/>
+                <w:szCs w:val="18"/>
+              </w:rPr>
+            </w:pPr>
+            <w:r>
+              <w:rPr>
+                <w:sz w:val="18"/>
+                <w:szCs w:val="18"/>
+              </w:rPr>
+              <w:sym w:font="Wingdings" w:char="F070"/>
+            </w:r>
+            <w:r>
+              <w:rPr>
+                <w:sz w:val="18"/>
+                <w:szCs w:val="18"/>
+              </w:rPr>
+              <w:t xml:space="preserve">Policy Document</w:t>
+            </w:r>
+          </w:p>
+          <w:p>
+            <w:pPr>
+              <w:spacing w:after="0" w:line="240" w:lineRule="auto"/>
+              <w:rPr>
+                <w:sz w:val="18"/>
+                <w:szCs w:val="18"/>
+              </w:rPr>
+            </w:pPr>
+            <w:r>
+              <w:rPr>
+                <w:sz w:val="18"/>
+                <w:szCs w:val="18"/>
+              </w:rPr>
+              <w:sym w:font="Wingdings" w:char="F070"/>
+            </w:r>
+            <w:r>
+              <w:rPr>
+                <w:sz w:val="18"/>
+                <w:szCs w:val="18"/>
+              </w:rPr>
+              <w:t xml:space="preserve">Regulation/Directives</w:t>
+            </w:r>
+          </w:p>
+          <w:p>
+            <w:pPr>
+              <w:spacing w:after="0" w:line="240" w:lineRule="auto"/>
+              <w:rPr>
+                <w:sz w:val="18"/>
+                <w:szCs w:val="18"/>
+              </w:rPr>
+            </w:pPr>
+            <w:r>
+              <w:rPr>
+                <w:sz w:val="18"/>
+                <w:szCs w:val="18"/>
+              </w:rPr>
+              <w:sym w:font="Wingdings" w:char="F070"/>
+            </w:r>
+            <w:r>
+              <w:rPr>
+                <w:sz w:val="18"/>
+                <w:szCs w:val="18"/>
+              </w:rPr>
+              <w:t xml:space="preserve">Recommendation of Regulator (NRA)</w:t>
+            </w:r>
+          </w:p>
+          <w:p>
+            <w:pPr>
+              <w:spacing w:after="0" w:line="240" w:lineRule="auto"/>
+              <w:rPr>
+                <w:sz w:val="18"/>
+                <w:szCs w:val="18"/>
+              </w:rPr>
+            </w:pPr>
+            <w:r>
+              <w:rPr>
+                <w:sz w:val="18"/>
+                <w:szCs w:val="18"/>
+              </w:rPr>
+              <w:sym w:font="Wingdings" w:char="F070"/>
+            </w:r>
+            <w:r>
+              <w:rPr>
+                <w:sz w:val="18"/>
+                <w:szCs w:val="18"/>
+              </w:rPr>
+              <w:t xml:space="preserve">Court Orders</w:t>
+            </w:r>
+          </w:p>
+          <w:p>
+            <w:pPr>
+              <w:spacing w:after="0" w:line="240" w:lineRule="auto"/>
+              <w:rPr>
+                <w:sz w:val="18"/>
+                <w:szCs w:val="18"/>
+              </w:rPr>
+            </w:pPr>
+            <w:r>
+              <w:rPr>
+                <w:sz w:val="18"/>
+                <w:szCs w:val="18"/>
+              </w:rPr>
+              <w:sym w:font="Wingdings" w:char="F070"/>
+            </w:r>
+            <w:r>
+              <w:rPr>
+                <w:sz w:val="18"/>
+                <w:szCs w:val="18"/>
+              </w:rPr>
+              <w:t xml:space="preserve">MOU between Operator</w:t>
+            </w:r>
+          </w:p>
+          <w:p>
+            <w:pPr>
+              <w:spacing w:after="0" w:line="240" w:lineRule="auto"/>
+              <w:rPr>
+                <w:sz w:val="18"/>
+                <w:szCs w:val="18"/>
+              </w:rPr>
+            </w:pPr>
+            <w:r>
+              <w:rPr>
+                <w:sz w:val="18"/>
+                <w:szCs w:val="18"/>
+              </w:rPr>
+              <w:sym w:font="Wingdings" w:char="F070"/>
+            </w:r>
+            <w:r>
+              <w:rPr>
+                <w:sz w:val="18"/>
+                <w:szCs w:val="18"/>
+              </w:rPr>
+              <w:t xml:space="preserve">NRA Compliance Notice</w:t>
+            </w:r>
+          </w:p>
+          <w:p>
+            <w:pPr>
+              <w:spacing w:after="0" w:line="240" w:lineRule="auto"/>
+              <w:rPr>
+                <w:sz w:val="18"/>
+                <w:szCs w:val="18"/>
+              </w:rPr>
+            </w:pPr>
+            <w:r>
+              <w:rPr>
+                <w:sz w:val="18"/>
+                <w:szCs w:val="18"/>
+              </w:rPr>
+              <w:sym w:font="Wingdings" w:char="F070"/>
+            </w:r>
+            <w:r>
+              <w:rPr>
+                <w:sz w:val="18"/>
+                <w:szCs w:val="18"/>
+              </w:rPr>
+              <w:t xml:space="preserve">Licensing Amendment</w:t>
+            </w:r>
+          </w:p>
+          <w:p>
+            <w:pPr>
+              <w:spacing w:after="0" w:line="240" w:lineRule="auto"/>
+              <w:rPr>
+                <w:sz w:val="18"/>
+                <w:szCs w:val="18"/>
+              </w:rPr>
+            </w:pPr>
+            <w:r>
+              <w:rPr>
+                <w:sz w:val="18"/>
+                <w:szCs w:val="18"/>
+              </w:rPr>
+              <w:sym w:font="Wingdings" w:char="F070"/>
+            </w:r>
+            <w:r>
+              <w:rPr>
+                <w:sz w:val="18"/>
+                <w:szCs w:val="18"/>
+              </w:rPr>
+              <w:t xml:space="preserve">Others</w:t>
+            </w:r>
+          </w:p>
+        </w:tc>
+        <w:tc>
+          <w:tcPr>
+            <w:tcW w:w="3222" w:type="dxa"/>
+          </w:tcPr>
+          <w:p>
+            <w:pPr>
+              <w:spacing w:after="0" w:line="240" w:lineRule="auto"/>
+              <w:jc w:val="center"/>
+              <w:rPr>
+                <w:b/>
+                <w:bCs/>
+                <w:sz w:val="18"/>
+                <w:szCs w:val="18"/>
+              </w:rPr>
+            </w:pPr>
+            <w:r>
+              <w:rPr>
+                <w:b/>
+                <w:bCs/>
+                <w:sz w:val="18"/>
+                <w:szCs w:val="18"/>
+              </w:rPr>
+              <w:t xml:space="preserve">“NO NEW NUMBER PORTING DEVELOPMENTS”</w:t>
+            </w:r>
+          </w:p>
+        </w:tc>
+        <w:tc>
+          <w:tcPr>
+            <w:tcW w:w="2349" w:type="dxa"/>
+          </w:tcPr>
+          <w:p>
+            <w:pPr>
+              <w:spacing w:after="0" w:line="240" w:lineRule="auto"/>
+              <w:rPr>
+                <w:sz w:val="18"/>
+                <w:szCs w:val="18"/>
+              </w:rPr>
+            </w:pPr>
+            <w:r>
+              <w:rPr>
+                <w:sz w:val="18"/>
+                <w:szCs w:val="18"/>
+              </w:rPr>
+              <w:sym w:font="Wingdings" w:char="F070"/>
+            </w:r>
+            <w:r>
+              <w:rPr>
+                <w:sz w:val="18"/>
+                <w:szCs w:val="18"/>
+              </w:rPr>
+              <w:t xml:space="preserve">Website</w:t>
+            </w:r>
+          </w:p>
+          <w:p>
+            <w:pPr>
+              <w:spacing w:after="0" w:line="240" w:lineRule="auto"/>
+              <w:rPr>
+                <w:sz w:val="18"/>
+                <w:szCs w:val="18"/>
+              </w:rPr>
+            </w:pPr>
+            <w:r>
+              <w:rPr>
+                <w:sz w:val="18"/>
+                <w:szCs w:val="18"/>
+              </w:rPr>
+              <w:sym w:font="Wingdings" w:char="F070"/>
+            </w:r>
+            <w:r>
+              <w:rPr>
+                <w:sz w:val="18"/>
+                <w:szCs w:val="18"/>
+              </w:rPr>
+              <w:t xml:space="preserve">Regulator/ITU</w:t>
+            </w:r>
+          </w:p>
+          <w:p>
+            <w:pPr>
+              <w:spacing w:after="0" w:line="240" w:lineRule="auto"/>
+              <w:rPr>
+                <w:sz w:val="18"/>
+                <w:szCs w:val="18"/>
+              </w:rPr>
+            </w:pPr>
+            <w:r>
+              <w:rPr>
+                <w:sz w:val="18"/>
+                <w:szCs w:val="18"/>
+              </w:rPr>
+              <w:sym w:font="Wingdings" w:char="F070"/>
+            </w:r>
+            <w:r>
+              <w:rPr>
+                <w:sz w:val="18"/>
+                <w:szCs w:val="18"/>
+              </w:rPr>
+              <w:t xml:space="preserve">Industry Publications</w:t>
+            </w:r>
+          </w:p>
+          <w:p>
+            <w:pPr>
+              <w:spacing w:after="0" w:line="240" w:lineRule="auto"/>
+              <w:rPr>
+                <w:sz w:val="18"/>
+                <w:szCs w:val="18"/>
+              </w:rPr>
+            </w:pPr>
+            <w:r>
+              <w:rPr>
+                <w:sz w:val="18"/>
+                <w:szCs w:val="18"/>
+              </w:rPr>
+              <w:sym w:font="Wingdings" w:char="F070"/>
+            </w:r>
+            <w:r>
+              <w:rPr>
+                <w:sz w:val="18"/>
+                <w:szCs w:val="18"/>
+              </w:rPr>
+              <w:t xml:space="preserve">News Media</w:t>
+            </w:r>
+          </w:p>
+          <w:p>
+            <w:pPr>
+              <w:spacing w:after="0" w:line="240" w:lineRule="auto"/>
+              <w:rPr>
+                <w:sz w:val="18"/>
+                <w:szCs w:val="18"/>
+              </w:rPr>
+            </w:pPr>
+            <w:r>
+              <w:rPr>
+                <w:sz w:val="18"/>
+                <w:szCs w:val="18"/>
+              </w:rPr>
+              <w:sym w:font="Wingdings" w:char="F070"/>
+            </w:r>
+            <w:r>
+              <w:rPr>
+                <w:sz w:val="18"/>
+                <w:szCs w:val="18"/>
+              </w:rPr>
+              <w:t xml:space="preserve">Other Operators</w:t>
+            </w:r>
+          </w:p>
+          <w:p>
+            <w:pPr>
+              <w:spacing w:after="0" w:line="240" w:lineRule="auto"/>
+              <w:rPr>
+                <w:sz w:val="18"/>
+                <w:szCs w:val="18"/>
+              </w:rPr>
+            </w:pPr>
+            <w:r>
+              <w:rPr>
+                <w:sz w:val="18"/>
+                <w:szCs w:val="18"/>
+              </w:rPr>
+              <w:sym w:font="Wingdings" w:char="F070"/>
+            </w:r>
+            <w:r>
+              <w:rPr>
+                <w:sz w:val="18"/>
+                <w:szCs w:val="18"/>
+              </w:rPr>
+              <w:t xml:space="preserve">Online Portals/Databases</w:t>
+            </w:r>
+          </w:p>
+          <w:p>
+            <w:pPr>
+              <w:spacing w:after="0" w:line="240" w:lineRule="auto"/>
+              <w:rPr>
+                <w:sz w:val="18"/>
+                <w:szCs w:val="18"/>
+              </w:rPr>
+            </w:pPr>
+            <w:r>
+              <w:rPr>
+                <w:sz w:val="18"/>
+                <w:szCs w:val="18"/>
+              </w:rPr>
+              <w:sym w:font="Wingdings" w:char="F070"/>
+            </w:r>
+            <w:r>
+              <w:rPr>
+                <w:sz w:val="18"/>
+                <w:szCs w:val="18"/>
+              </w:rPr>
+              <w:t xml:space="preserve">Other source</w:t>
+            </w:r>
+          </w:p>
+        </w:tc>
+        <w:tc>
+          <w:tcPr>
+            <w:tcW w:w="1120" w:type="dxa"/>
+          </w:tcPr>
+          <w:p>
+            <w:pPr>
+              <w:spacing w:after="0" w:line="240" w:lineRule="auto"/>
+              <w:jc w:val="center"/>
+              <w:rPr>
+                <w:b/>
+                <w:bCs/>
+                <w:sz w:val="18"/>
+                <w:szCs w:val="18"/>
+              </w:rPr>
+            </w:pPr>
+            <w:r>
+              <w:rPr>
+                <w:b/>
+                <w:bCs/>
+                <w:sz w:val="18"/>
+                <w:szCs w:val="18"/>
+              </w:rPr>
+              <w:t xml:space="preserve">N/A</w:t>
+            </w:r>
+          </w:p>
+        </w:tc>
+        <w:tc>
+          <w:tcPr>
+            <w:tcW w:w="1691" w:type="dxa"/>
+          </w:tcPr>
+          <w:p>
+            <w:pPr>
+              <w:spacing w:after="0" w:line="240" w:lineRule="auto"/>
+              <w:jc w:val="center"/>
+              <w:rPr>
+                <w:sz w:val="18"/>
+                <w:szCs w:val="18"/>
+              </w:rPr>
+            </w:pPr>
+            <w:r>
+              <w:rPr>
+                <w:sz w:val="18"/>
+                <w:szCs w:val="18"/>
+              </w:rPr>
+              <w:t xml:space="preserve">N/A</w:t>
+            </w:r>
+          </w:p>
+        </w:tc>
+        <w:tc>
+          <w:tcPr>
+            <w:tcW w:w="2270" w:type="dxa"/>
+          </w:tcPr>
+          <w:p>
+            <w:pPr>
+              <w:spacing w:after="0" w:line="240" w:lineRule="auto"/>
+              <w:jc w:val="center"/>
+              <w:rPr>
+                <w:sz w:val="18"/>
+                <w:szCs w:val="18"/>
+              </w:rPr>
+            </w:pPr>
+            <w:r>
+              <w:rPr>
+                <w:sz w:val="18"/>
+                <w:szCs w:val="18"/>
+              </w:rPr>
+              <w:t xml:space="preserve">N/A</w:t>
+            </w:r>
+          </w:p>
+        </w:tc>
+      </w:tr>
+      <w:tr>
+        <w:tc>
+          <w:tcPr>
+            <w:tcW w:w="1364" w:type="dxa"/>
+          </w:tcPr>
+          <w:p>
+            <w:pPr>
+              <w:spacing w:after="0" w:line="240" w:lineRule="auto"/>
+              <w:rPr>
+                <w:rFonts w:ascii="Calibri" w:hAnsi="Calibri" w:cs="Calibri"/>
+                <w:color w:val="000000"/>
+                <w:sz w:val="18"/>
+                <w:szCs w:val="18"/>
+              </w:rPr>
+            </w:pPr>
+            <w:r>
+              <w:rPr>
+                <w:color w:val="000000"/>
+                <w:sz w:val="18"/>
+                <w:szCs w:val="18"/>
+              </w:rPr>
+              <w:lastRenderedPageBreak/>
+              <w:t>Emergency Services Obligations</w:t>
+            </w:r>
+          </w:p>
+        </w:tc>
+        <w:tc>
+          <w:tcPr>
+            <w:tcW w:w="2132" w:type="dxa"/>
+          </w:tcPr>
+          <w:p>
+            <w:pPr>
+              <w:spacing w:after="0" w:line="240" w:lineRule="auto"/>
+              <w:rPr>
+                <w:sz w:val="18"/>
+                <w:szCs w:val="18"/>
+              </w:rPr>
+            </w:pPr>
+            <w:r>
+              <w:rPr>
+                <w:sz w:val="18"/>
+                <w:szCs w:val="18"/>
+              </w:rPr>
+              <w:sym w:font="Wingdings" w:char="F070"/>
+            </w:r>
+            <w:r>
+              <w:rPr>
+                <w:sz w:val="18"/>
+                <w:szCs w:val="18"/>
+              </w:rPr>
+              <w:t xml:space="preserve">Consultation Paper</w:t>
+            </w:r>
+          </w:p>
+          <w:p>
+            <w:pPr>
+              <w:spacing w:after="0" w:line="240" w:lineRule="auto"/>
+              <w:rPr>
+                <w:sz w:val="18"/>
+                <w:szCs w:val="18"/>
+              </w:rPr>
+            </w:pPr>
+            <w:r>
+              <w:rPr>
+                <w:sz w:val="18"/>
+                <w:szCs w:val="18"/>
+              </w:rPr>
+              <w:sym w:font="Wingdings" w:char="F070"/>
+            </w:r>
+            <w:r>
+              <w:rPr>
+                <w:sz w:val="18"/>
+                <w:szCs w:val="18"/>
+              </w:rPr>
+              <w:t xml:space="preserve">Initial Talks</w:t>
+            </w:r>
+          </w:p>
+          <w:p>
+            <w:pPr>
+              <w:spacing w:after="0" w:line="240" w:lineRule="auto"/>
+              <w:rPr>
+                <w:sz w:val="18"/>
+                <w:szCs w:val="18"/>
+              </w:rPr>
+            </w:pPr>
+            <w:r>
+              <w:rPr>
+                <w:sz w:val="18"/>
+                <w:szCs w:val="18"/>
+              </w:rPr>
+              <w:sym w:font="Wingdings" w:char="F070"/>
+            </w:r>
+            <w:r>
+              <w:rPr>
+                <w:sz w:val="18"/>
+                <w:szCs w:val="18"/>
+              </w:rPr>
+              <w:t xml:space="preserve">Policy Document</w:t>
+            </w:r>
+          </w:p>
+          <w:p>
+            <w:pPr>
+              <w:spacing w:after="0" w:line="240" w:lineRule="auto"/>
+              <w:rPr>
+                <w:sz w:val="18"/>
+                <w:szCs w:val="18"/>
+              </w:rPr>
+            </w:pPr>
+            <w:r>
+              <w:rPr>
+                <w:sz w:val="18"/>
+                <w:szCs w:val="18"/>
+              </w:rPr>
+              <w:sym w:font="Wingdings" w:char="F070"/>
+            </w:r>
+            <w:r>
+              <w:rPr>
+                <w:sz w:val="18"/>
+                <w:szCs w:val="18"/>
+              </w:rPr>
+              <w:t xml:space="preserve">Regulation/Directives</w:t>
+            </w:r>
+          </w:p>
+          <w:p>
+            <w:pPr>
+              <w:spacing w:after="0" w:line="240" w:lineRule="auto"/>
+              <w:rPr>
+                <w:sz w:val="18"/>
+                <w:szCs w:val="18"/>
+              </w:rPr>
+            </w:pPr>
+            <w:r>
+              <w:rPr>
+                <w:sz w:val="18"/>
+                <w:szCs w:val="18"/>
+              </w:rPr>
+              <w:sym w:font="Wingdings" w:char="F070"/>
+            </w:r>
+            <w:r>
+              <w:rPr>
+                <w:sz w:val="18"/>
+                <w:szCs w:val="18"/>
+              </w:rPr>
+              <w:t xml:space="preserve">Recommendation of Regulator (NRA)</w:t>
+            </w:r>
+          </w:p>
+          <w:p>
+            <w:pPr>
+              <w:spacing w:after="0" w:line="240" w:lineRule="auto"/>
+              <w:rPr>
+                <w:sz w:val="18"/>
+                <w:szCs w:val="18"/>
+              </w:rPr>
+            </w:pPr>
+            <w:r>
+              <w:rPr>
+                <w:sz w:val="18"/>
+                <w:szCs w:val="18"/>
+              </w:rPr>
+              <w:sym w:font="Wingdings" w:char="F070"/>
+            </w:r>
+            <w:r>
+              <w:rPr>
+                <w:sz w:val="18"/>
+                <w:szCs w:val="18"/>
+              </w:rPr>
+              <w:t xml:space="preserve">Court Orders</w:t>
+            </w:r>
+          </w:p>
+          <w:p>
+            <w:pPr>
+              <w:spacing w:after="0" w:line="240" w:lineRule="auto"/>
+              <w:rPr>
+                <w:sz w:val="18"/>
+                <w:szCs w:val="18"/>
+              </w:rPr>
+            </w:pPr>
+            <w:r>
+              <w:rPr>
+                <w:sz w:val="18"/>
+                <w:szCs w:val="18"/>
+              </w:rPr>
+              <w:sym w:font="Wingdings" w:char="F070"/>
+            </w:r>
+            <w:r>
+              <w:rPr>
+                <w:sz w:val="18"/>
+                <w:szCs w:val="18"/>
+              </w:rPr>
+              <w:t xml:space="preserve">MOU between Operator</w:t>
+            </w:r>
+          </w:p>
+          <w:p>
+            <w:pPr>
+              <w:spacing w:after="0" w:line="240" w:lineRule="auto"/>
+              <w:rPr>
+                <w:sz w:val="18"/>
+                <w:szCs w:val="18"/>
+              </w:rPr>
+            </w:pPr>
+            <w:r>
+              <w:rPr>
+                <w:sz w:val="18"/>
+                <w:szCs w:val="18"/>
+              </w:rPr>
+              <w:sym w:font="Wingdings" w:char="F070"/>
+            </w:r>
+            <w:r>
+              <w:rPr>
+                <w:sz w:val="18"/>
+                <w:szCs w:val="18"/>
+              </w:rPr>
+              <w:t xml:space="preserve">NRA Compliance Notice</w:t>
+            </w:r>
+          </w:p>
+          <w:p>
+            <w:pPr>
+              <w:spacing w:after="0" w:line="240" w:lineRule="auto"/>
+              <w:rPr>
+                <w:sz w:val="18"/>
+                <w:szCs w:val="18"/>
+              </w:rPr>
+            </w:pPr>
+            <w:r>
+              <w:rPr>
+                <w:sz w:val="18"/>
+                <w:szCs w:val="18"/>
+              </w:rPr>
+              <w:sym w:font="Wingdings" w:char="F070"/>
+            </w:r>
+            <w:r>
+              <w:rPr>
+                <w:sz w:val="18"/>
+                <w:szCs w:val="18"/>
+              </w:rPr>
+              <w:t xml:space="preserve">Licensing Amendment</w:t>
+            </w:r>
+          </w:p>
+          <w:p>
+            <w:pPr>
+              <w:spacing w:after="0" w:line="240" w:lineRule="auto"/>
+              <w:rPr>
+                <w:sz w:val="18"/>
+                <w:szCs w:val="18"/>
+              </w:rPr>
+            </w:pPr>
+            <w:r>
+              <w:rPr>
+                <w:sz w:val="18"/>
+                <w:szCs w:val="18"/>
+              </w:rPr>
+              <w:sym w:font="Wingdings" w:char="F070"/>
+            </w:r>
+            <w:r>
+              <w:rPr>
+                <w:sz w:val="18"/>
+                <w:szCs w:val="18"/>
+              </w:rPr>
+              <w:t xml:space="preserve">Others</w:t>
+            </w:r>
+          </w:p>
+        </w:tc>
+        <w:tc>
+          <w:tcPr>
+            <w:tcW w:w="3222" w:type="dxa"/>
+          </w:tcPr>
+          <w:p>
+            <w:pPr>
+              <w:spacing w:after="0" w:line="240" w:lineRule="auto"/>
+              <w:jc w:val="center"/>
+              <w:rPr>
+                <w:b/>
+                <w:bCs/>
+                <w:sz w:val="18"/>
+                <w:szCs w:val="18"/>
+              </w:rPr>
+            </w:pPr>
+            <w:r>
+              <w:rPr>
+                <w:b/>
+                <w:bCs/>
+                <w:sz w:val="18"/>
+                <w:szCs w:val="18"/>
+              </w:rPr>
+              <w:t xml:space="preserve">“NO UPDATED INFORMATION IS AVAILABLE, INFORMATION IS SAME AS EARLIER”</w:t>
+            </w:r>
+          </w:p>
+        </w:tc>
+        <w:tc>
+          <w:tcPr>
+            <w:tcW w:w="2349" w:type="dxa"/>
+          </w:tcPr>
+          <w:p>
+            <w:pPr>
+              <w:spacing w:after="0" w:line="240" w:lineRule="auto"/>
+              <w:rPr>
+                <w:sz w:val="18"/>
+                <w:szCs w:val="18"/>
+              </w:rPr>
+            </w:pPr>
+            <w:r>
+              <w:rPr>
+                <w:sz w:val="18"/>
+                <w:szCs w:val="18"/>
+              </w:rPr>
+              <w:sym w:font="Wingdings" w:char="F070"/>
+            </w:r>
+            <w:r>
+              <w:rPr>
+                <w:sz w:val="18"/>
+                <w:szCs w:val="18"/>
+              </w:rPr>
+              <w:t xml:space="preserve">Website</w:t>
+            </w:r>
+          </w:p>
+          <w:p>
+            <w:pPr>
+              <w:spacing w:after="0" w:line="240" w:lineRule="auto"/>
+              <w:rPr>
+                <w:sz w:val="18"/>
+                <w:szCs w:val="18"/>
+              </w:rPr>
+            </w:pPr>
+            <w:r>
+              <w:rPr>
+                <w:sz w:val="18"/>
+                <w:szCs w:val="18"/>
+              </w:rPr>
+              <w:sym w:font="Wingdings" w:char="F070"/>
+            </w:r>
+            <w:r>
+              <w:rPr>
+                <w:sz w:val="18"/>
+                <w:szCs w:val="18"/>
+              </w:rPr>
+              <w:t xml:space="preserve">Regulator/ITU</w:t>
+            </w:r>
+          </w:p>
+          <w:p>
+            <w:pPr>
+              <w:spacing w:after="0" w:line="240" w:lineRule="auto"/>
+              <w:rPr>
+                <w:sz w:val="18"/>
+                <w:szCs w:val="18"/>
+              </w:rPr>
+            </w:pPr>
+            <w:r>
+              <w:rPr>
+                <w:sz w:val="18"/>
+                <w:szCs w:val="18"/>
+              </w:rPr>
+              <w:sym w:font="Wingdings" w:char="F070"/>
+            </w:r>
+            <w:r>
+              <w:rPr>
+                <w:sz w:val="18"/>
+                <w:szCs w:val="18"/>
+              </w:rPr>
+              <w:t xml:space="preserve">Industry Publications</w:t>
+            </w:r>
+          </w:p>
+          <w:p>
+            <w:pPr>
+              <w:spacing w:after="0" w:line="240" w:lineRule="auto"/>
+              <w:rPr>
+                <w:sz w:val="18"/>
+                <w:szCs w:val="18"/>
+              </w:rPr>
+            </w:pPr>
+            <w:r>
+              <w:rPr>
+                <w:sz w:val="18"/>
+                <w:szCs w:val="18"/>
+              </w:rPr>
+              <w:sym w:font="Wingdings" w:char="F070"/>
+            </w:r>
+            <w:r>
+              <w:rPr>
+                <w:sz w:val="18"/>
+                <w:szCs w:val="18"/>
+              </w:rPr>
+              <w:t xml:space="preserve">News Media</w:t>
+            </w:r>
+          </w:p>
+          <w:p>
+            <w:pPr>
+              <w:spacing w:after="0" w:line="240" w:lineRule="auto"/>
+              <w:rPr>
+                <w:sz w:val="18"/>
+                <w:szCs w:val="18"/>
+              </w:rPr>
+            </w:pPr>
+            <w:r>
+              <w:rPr>
+                <w:sz w:val="18"/>
+                <w:szCs w:val="18"/>
+              </w:rPr>
+              <w:sym w:font="Wingdings" w:char="F070"/>
+            </w:r>
+            <w:r>
+              <w:rPr>
+                <w:sz w:val="18"/>
+                <w:szCs w:val="18"/>
+              </w:rPr>
+              <w:t xml:space="preserve">Other Operators</w:t>
+            </w:r>
+          </w:p>
+          <w:p>
+            <w:pPr>
+              <w:spacing w:after="0" w:line="240" w:lineRule="auto"/>
+              <w:rPr>
+                <w:sz w:val="18"/>
+                <w:szCs w:val="18"/>
+              </w:rPr>
+            </w:pPr>
+            <w:r>
+              <w:rPr>
+                <w:sz w:val="18"/>
+                <w:szCs w:val="18"/>
+              </w:rPr>
+              <w:sym w:font="Wingdings" w:char="F070"/>
+            </w:r>
+            <w:r>
+              <w:rPr>
+                <w:sz w:val="18"/>
+                <w:szCs w:val="18"/>
+              </w:rPr>
+              <w:t xml:space="preserve">Online Portals/Databases</w:t>
+            </w:r>
+          </w:p>
+          <w:p>
+            <w:pPr>
+              <w:spacing w:after="0" w:line="240" w:lineRule="auto"/>
+              <w:rPr>
+                <w:sz w:val="18"/>
+                <w:szCs w:val="18"/>
+              </w:rPr>
+            </w:pPr>
+            <w:r>
+              <w:rPr>
+                <w:sz w:val="18"/>
+                <w:szCs w:val="18"/>
+              </w:rPr>
+              <w:sym w:font="Wingdings" w:char="F070"/>
+            </w:r>
+            <w:r>
+              <w:rPr>
+                <w:sz w:val="18"/>
+                <w:szCs w:val="18"/>
+              </w:rPr>
+              <w:t xml:space="preserve">Other source</w:t>
+            </w:r>
+          </w:p>
+        </w:tc>
+        <w:tc>
+          <w:tcPr>
+            <w:tcW w:w="1120" w:type="dxa"/>
+          </w:tcPr>
+          <w:p>
+            <w:pPr>
+              <w:spacing w:after="0" w:line="240" w:lineRule="auto"/>
+              <w:jc w:val="center"/>
+              <w:rPr>
+                <w:b/>
+                <w:bCs/>
+                <w:sz w:val="18"/>
+                <w:szCs w:val="18"/>
+              </w:rPr>
+            </w:pPr>
+            <w:r>
+              <w:rPr>
+                <w:b/>
+                <w:bCs/>
+                <w:sz w:val="18"/>
+                <w:szCs w:val="18"/>
+              </w:rPr>
+              <w:t xml:space="preserve">N/A</w:t>
+            </w:r>
+          </w:p>
+        </w:tc>
+        <w:tc>
+          <w:tcPr>
+            <w:tcW w:w="1691" w:type="dxa"/>
+          </w:tcPr>
+          <w:p>
+            <w:pPr>
+              <w:spacing w:after="0" w:line="240" w:lineRule="auto"/>
+              <w:jc w:val="center"/>
+              <w:rPr>
+                <w:sz w:val="18"/>
+                <w:szCs w:val="18"/>
+              </w:rPr>
+            </w:pPr>
+            <w:r>
+              <w:rPr>
+                <w:sz w:val="18"/>
+                <w:szCs w:val="18"/>
+              </w:rPr>
+              <w:t xml:space="preserve">N/A</w:t>
+            </w:r>
+          </w:p>
+        </w:tc>
+        <w:tc>
+          <w:tcPr>
+            <w:tcW w:w="2270" w:type="dxa"/>
+          </w:tcPr>
+          <w:p>
+            <w:pPr>
+              <w:spacing w:after="0" w:line="240" w:lineRule="auto"/>
+              <w:jc w:val="center"/>
+              <w:rPr>
+                <w:sz w:val="18"/>
+                <w:szCs w:val="18"/>
+              </w:rPr>
+            </w:pPr>
+            <w:r>
+              <w:rPr>
+                <w:sz w:val="18"/>
+                <w:szCs w:val="18"/>
+              </w:rPr>
+              <w:t xml:space="preserve">N/A</w:t>
+            </w:r>
+          </w:p>
+        </w:tc>
+      </w:tr>
+      <w:tr>
+        <w:tc>
+          <w:tcPr>
+            <w:tcW w:w="1364" w:type="dxa"/>
+          </w:tcPr>
+          <w:p>
+            <w:pPr>
+              <w:spacing w:after="0" w:line="240" w:lineRule="auto"/>
+              <w:rPr>
+                <w:sz w:val="18"/>
+                <w:szCs w:val="18"/>
+              </w:rPr>
+            </w:pPr>
+            <w:r>
+              <w:rPr>
+                <w:color w:val="000000"/>
+                <w:sz w:val="18"/>
+                <w:szCs w:val="18"/>
+              </w:rPr>
+              <w:t>Directory Enquiry Obligations</w:t>
+            </w:r>
+          </w:p>
+        </w:tc>
+        <w:tc>
+          <w:tcPr>
+            <w:tcW w:w="2132" w:type="dxa"/>
+          </w:tcPr>
+          <w:p>
+            <w:pPr>
+              <w:spacing w:after="0" w:line="240" w:lineRule="auto"/>
+              <w:rPr>
+                <w:sz w:val="18"/>
+                <w:szCs w:val="18"/>
+              </w:rPr>
+            </w:pPr>
+            <w:r>
+              <w:rPr>
+                <w:sz w:val="18"/>
+                <w:szCs w:val="18"/>
+              </w:rPr>
+              <w:sym w:font="Wingdings" w:char="F070"/>
+            </w:r>
+            <w:r>
+              <w:rPr>
+                <w:sz w:val="18"/>
+                <w:szCs w:val="18"/>
+              </w:rPr>
+              <w:t xml:space="preserve">Consultation Paper</w:t>
+            </w:r>
+          </w:p>
+          <w:p>
+            <w:pPr>
+              <w:spacing w:after="0" w:line="240" w:lineRule="auto"/>
+              <w:rPr>
+                <w:sz w:val="18"/>
+                <w:szCs w:val="18"/>
+              </w:rPr>
+            </w:pPr>
+            <w:r>
+              <w:rPr>
+                <w:sz w:val="18"/>
+                <w:szCs w:val="18"/>
+              </w:rPr>
+              <w:sym w:font="Wingdings" w:char="F070"/>
+            </w:r>
+            <w:r>
+              <w:rPr>
+                <w:sz w:val="18"/>
+                <w:szCs w:val="18"/>
+              </w:rPr>
+              <w:t xml:space="preserve">Initial Talks</w:t>
+            </w:r>
+          </w:p>
+          <w:p>
+            <w:pPr>
+              <w:spacing w:after="0" w:line="240" w:lineRule="auto"/>
+              <w:rPr>
+                <w:sz w:val="18"/>
+                <w:szCs w:val="18"/>
+              </w:rPr>
+            </w:pPr>
+            <w:r>
+              <w:rPr>
+                <w:sz w:val="18"/>
+                <w:szCs w:val="18"/>
+              </w:rPr>
+              <w:sym w:font="Wingdings" w:char="F070"/>
+            </w:r>
+            <w:r>
+              <w:rPr>
+                <w:sz w:val="18"/>
+                <w:szCs w:val="18"/>
+              </w:rPr>
+              <w:t xml:space="preserve">Policy Document</w:t>
+            </w:r>
+          </w:p>
+          <w:p>
+            <w:pPr>
+              <w:spacing w:after="0" w:line="240" w:lineRule="auto"/>
+              <w:rPr>
+                <w:sz w:val="18"/>
+                <w:szCs w:val="18"/>
+              </w:rPr>
+            </w:pPr>
+            <w:r>
+              <w:rPr>
+                <w:sz w:val="18"/>
+                <w:szCs w:val="18"/>
+              </w:rPr>
+              <w:sym w:font="Wingdings" w:char="F070"/>
+            </w:r>
+            <w:r>
+              <w:rPr>
+                <w:sz w:val="18"/>
+                <w:szCs w:val="18"/>
+              </w:rPr>
+              <w:t xml:space="preserve">Regulation/Directives</w:t>
+            </w:r>
+          </w:p>
+          <w:p>
+            <w:pPr>
+              <w:spacing w:after="0" w:line="240" w:lineRule="auto"/>
+              <w:rPr>
+                <w:sz w:val="18"/>
+                <w:szCs w:val="18"/>
+              </w:rPr>
+            </w:pPr>
+            <w:r>
+              <w:rPr>
+                <w:sz w:val="18"/>
+                <w:szCs w:val="18"/>
+              </w:rPr>
+              <w:sym w:font="Wingdings" w:char="F070"/>
+            </w:r>
+            <w:r>
+              <w:rPr>
+                <w:sz w:val="18"/>
+                <w:szCs w:val="18"/>
+              </w:rPr>
+              <w:t xml:space="preserve">Recommendation of Regulator (NRA)</w:t>
+            </w:r>
+          </w:p>
+          <w:p>
+            <w:pPr>
+              <w:spacing w:after="0" w:line="240" w:lineRule="auto"/>
+              <w:rPr>
+                <w:sz w:val="18"/>
+                <w:szCs w:val="18"/>
+              </w:rPr>
+            </w:pPr>
+            <w:r>
+              <w:rPr>
+                <w:sz w:val="18"/>
+                <w:szCs w:val="18"/>
+              </w:rPr>
+              <w:sym w:font="Wingdings" w:char="F070"/>
+            </w:r>
+            <w:r>
+              <w:rPr>
+                <w:sz w:val="18"/>
+                <w:szCs w:val="18"/>
+              </w:rPr>
+              <w:t xml:space="preserve">Court Orders</w:t>
+            </w:r>
+          </w:p>
+          <w:p>
+            <w:pPr>
+              <w:spacing w:after="0" w:line="240" w:lineRule="auto"/>
+              <w:rPr>
+                <w:sz w:val="18"/>
+                <w:szCs w:val="18"/>
+              </w:rPr>
+            </w:pPr>
+            <w:r>
+              <w:rPr>
+                <w:sz w:val="18"/>
+                <w:szCs w:val="18"/>
+              </w:rPr>
+              <w:sym w:font="Wingdings" w:char="F070"/>
+            </w:r>
+            <w:r>
+              <w:rPr>
+                <w:sz w:val="18"/>
+                <w:szCs w:val="18"/>
+              </w:rPr>
+              <w:t xml:space="preserve">MOU between Operator</w:t>
+            </w:r>
+          </w:p>
+          <w:p>
+            <w:pPr>
+              <w:spacing w:after="0" w:line="240" w:lineRule="auto"/>
+              <w:rPr>
+                <w:sz w:val="18"/>
+                <w:szCs w:val="18"/>
+              </w:rPr>
+            </w:pPr>
+            <w:r>
+              <w:rPr>
+                <w:sz w:val="18"/>
+                <w:szCs w:val="18"/>
+              </w:rPr>
+              <w:sym w:font="Wingdings" w:char="F070"/>
+            </w:r>
+            <w:r>
+              <w:rPr>
+                <w:sz w:val="18"/>
+                <w:szCs w:val="18"/>
+              </w:rPr>
+              <w:t xml:space="preserve">NRA Compliance Notice</w:t>
+            </w:r>
+          </w:p>
+          <w:p>
+            <w:pPr>
+              <w:spacing w:after="0" w:line="240" w:lineRule="auto"/>
+              <w:rPr>
+                <w:sz w:val="18"/>
+                <w:szCs w:val="18"/>
+              </w:rPr>
+            </w:pPr>
+            <w:r>
+              <w:rPr>
+                <w:sz w:val="18"/>
+                <w:szCs w:val="18"/>
+              </w:rPr>
+              <w:sym w:font="Wingdings" w:char="F070"/>
+            </w:r>
+            <w:r>
+              <w:rPr>
+                <w:sz w:val="18"/>
+                <w:szCs w:val="18"/>
+              </w:rPr>
+              <w:t xml:space="preserve">Licensing Amendment</w:t>
+            </w:r>
+          </w:p>
+          <w:p>
+            <w:pPr>
+              <w:spacing w:after="0" w:line="240" w:lineRule="auto"/>
+              <w:rPr>
+                <w:sz w:val="18"/>
+                <w:szCs w:val="18"/>
+              </w:rPr>
+            </w:pPr>
+            <w:r>
+              <w:rPr>
+                <w:sz w:val="18"/>
+                <w:szCs w:val="18"/>
+              </w:rPr>
+              <w:sym w:font="Wingdings" w:char="F070"/>
+            </w:r>
+            <w:r>
+              <w:rPr>
+                <w:sz w:val="18"/>
+                <w:szCs w:val="18"/>
+              </w:rPr>
+              <w:t xml:space="preserve">Others</w:t>
+            </w:r>
+          </w:p>
+        </w:tc>
+        <w:tc>
+          <w:tcPr>
+            <w:tcW w:w="3222" w:type="dxa"/>
+          </w:tcPr>
+          <w:p>
+            <w:pPr>
+              <w:spacing w:after="0" w:line="240" w:lineRule="auto"/>
+              <w:jc w:val="center"/>
+              <w:rPr>
+                <w:b/>
+                <w:bCs/>
+                <w:sz w:val="18"/>
+                <w:szCs w:val="18"/>
+              </w:rPr>
+            </w:pPr>
+            <w:r>
+              <w:rPr>
+                <w:b/>
+                <w:bCs/>
+                <w:sz w:val="18"/>
+                <w:szCs w:val="18"/>
+              </w:rPr>
+              <w:t xml:space="preserve">“NO UPDATED INFORMATION IS AVAILABLE, INFORMATION IS SAME AS EARLIER”</w:t>
+            </w:r>
+          </w:p>
+        </w:tc>
+        <w:tc>
+          <w:tcPr>
+            <w:tcW w:w="2349" w:type="dxa"/>
+          </w:tcPr>
+          <w:p>
+            <w:pPr>
+              <w:spacing w:after="0" w:line="240" w:lineRule="auto"/>
+              <w:rPr>
+                <w:sz w:val="18"/>
+                <w:szCs w:val="18"/>
+              </w:rPr>
+            </w:pPr>
+            <w:r>
+              <w:rPr>
+                <w:sz w:val="18"/>
+                <w:szCs w:val="18"/>
+              </w:rPr>
+              <w:sym w:font="Wingdings" w:char="F070"/>
+            </w:r>
+            <w:r>
+              <w:rPr>
+                <w:sz w:val="18"/>
+                <w:szCs w:val="18"/>
+              </w:rPr>
+              <w:t xml:space="preserve">Website</w:t>
+            </w:r>
+          </w:p>
+          <w:p>
+            <w:pPr>
+              <w:spacing w:after="0" w:line="240" w:lineRule="auto"/>
+              <w:rPr>
+                <w:sz w:val="18"/>
+                <w:szCs w:val="18"/>
+              </w:rPr>
+            </w:pPr>
+            <w:r>
+              <w:rPr>
+                <w:sz w:val="18"/>
+                <w:szCs w:val="18"/>
+              </w:rPr>
+              <w:sym w:font="Wingdings" w:char="F070"/>
+            </w:r>
+            <w:r>
+              <w:rPr>
+                <w:sz w:val="18"/>
+                <w:szCs w:val="18"/>
+              </w:rPr>
+              <w:t xml:space="preserve">Regulator/ITU</w:t>
+            </w:r>
+          </w:p>
+          <w:p>
+            <w:pPr>
+              <w:spacing w:after="0" w:line="240" w:lineRule="auto"/>
+              <w:rPr>
+                <w:sz w:val="18"/>
+                <w:szCs w:val="18"/>
+              </w:rPr>
+            </w:pPr>
+            <w:r>
+              <w:rPr>
+                <w:sz w:val="18"/>
+                <w:szCs w:val="18"/>
+              </w:rPr>
+              <w:sym w:font="Wingdings" w:char="F070"/>
+            </w:r>
+            <w:r>
+              <w:rPr>
+                <w:sz w:val="18"/>
+                <w:szCs w:val="18"/>
+              </w:rPr>
+              <w:t xml:space="preserve">Industry Publications</w:t>
+            </w:r>
+          </w:p>
+          <w:p>
+            <w:pPr>
+              <w:spacing w:after="0" w:line="240" w:lineRule="auto"/>
+              <w:rPr>
+                <w:sz w:val="18"/>
+                <w:szCs w:val="18"/>
+              </w:rPr>
+            </w:pPr>
+            <w:r>
+              <w:rPr>
+                <w:sz w:val="18"/>
+                <w:szCs w:val="18"/>
+              </w:rPr>
+              <w:sym w:font="Wingdings" w:char="F070"/>
+            </w:r>
+            <w:r>
+              <w:rPr>
+                <w:sz w:val="18"/>
+                <w:szCs w:val="18"/>
+              </w:rPr>
+              <w:t xml:space="preserve">News Media</w:t>
+            </w:r>
+          </w:p>
+          <w:p>
+            <w:pPr>
+              <w:spacing w:after="0" w:line="240" w:lineRule="auto"/>
+              <w:rPr>
+                <w:sz w:val="18"/>
+                <w:szCs w:val="18"/>
+              </w:rPr>
+            </w:pPr>
+            <w:r>
+              <w:rPr>
+                <w:sz w:val="18"/>
+                <w:szCs w:val="18"/>
+              </w:rPr>
+              <w:sym w:font="Wingdings" w:char="F070"/>
+            </w:r>
+            <w:r>
+              <w:rPr>
+                <w:sz w:val="18"/>
+                <w:szCs w:val="18"/>
+              </w:rPr>
+              <w:t xml:space="preserve">Other Operators</w:t>
+            </w:r>
+          </w:p>
+          <w:p>
+            <w:pPr>
+              <w:spacing w:after="0" w:line="240" w:lineRule="auto"/>
+              <w:rPr>
+                <w:sz w:val="18"/>
+                <w:szCs w:val="18"/>
+              </w:rPr>
+            </w:pPr>
+            <w:r>
+              <w:rPr>
+                <w:sz w:val="18"/>
+                <w:szCs w:val="18"/>
+              </w:rPr>
+              <w:sym w:font="Wingdings" w:char="F070"/>
+            </w:r>
+            <w:r>
+              <w:rPr>
+                <w:sz w:val="18"/>
+                <w:szCs w:val="18"/>
+              </w:rPr>
+              <w:t xml:space="preserve">Online Portals/Databases</w:t>
+            </w:r>
+          </w:p>
+          <w:p>
+            <w:pPr>
+              <w:spacing w:after="0" w:line="240" w:lineRule="auto"/>
+              <w:rPr>
+                <w:sz w:val="18"/>
+                <w:szCs w:val="18"/>
+              </w:rPr>
+            </w:pPr>
+            <w:r>
+              <w:rPr>
+                <w:sz w:val="18"/>
+                <w:szCs w:val="18"/>
+              </w:rPr>
+              <w:sym w:font="Wingdings" w:char="F070"/>
+            </w:r>
+            <w:r>
+              <w:rPr>
+                <w:sz w:val="18"/>
+                <w:szCs w:val="18"/>
+              </w:rPr>
+              <w:t xml:space="preserve">Other source</w:t>
+            </w:r>
+          </w:p>
+        </w:tc>
+        <w:tc>
+          <w:tcPr>
+            <w:tcW w:w="1120" w:type="dxa"/>
+          </w:tcPr>
+          <w:p>
+            <w:pPr>
+              <w:spacing w:after="0" w:line="240" w:lineRule="auto"/>
+              <w:jc w:val="center"/>
+              <w:rPr>
+                <w:b/>
+                <w:bCs/>
+                <w:sz w:val="18"/>
+                <w:szCs w:val="18"/>
+              </w:rPr>
+            </w:pPr>
+            <w:r>
+              <w:rPr>
+                <w:b/>
+                <w:bCs/>
+                <w:sz w:val="18"/>
+                <w:szCs w:val="18"/>
+              </w:rPr>
+              <w:t xml:space="preserve">N/A</w:t>
+            </w:r>
+          </w:p>
+        </w:tc>
+        <w:tc>
+          <w:tcPr>
+            <w:tcW w:w="1691" w:type="dxa"/>
+          </w:tcPr>
+          <w:p>
+            <w:pPr>
+              <w:spacing w:after="0" w:line="240" w:lineRule="auto"/>
+              <w:jc w:val="center"/>
+              <w:rPr>
+                <w:sz w:val="18"/>
+                <w:szCs w:val="18"/>
+              </w:rPr>
+            </w:pPr>
+            <w:r>
+              <w:rPr>
+                <w:sz w:val="18"/>
+                <w:szCs w:val="18"/>
+              </w:rPr>
+              <w:t xml:space="preserve">N/A</w:t>
+            </w:r>
+          </w:p>
+        </w:tc>
+        <w:tc>
+          <w:tcPr>
+            <w:tcW w:w="2270" w:type="dxa"/>
+          </w:tcPr>
+          <w:p>
+            <w:pPr>
+              <w:spacing w:after="0" w:line="240" w:lineRule="auto"/>
+              <w:jc w:val="center"/>
+              <w:rPr>
+                <w:sz w:val="18"/>
+                <w:szCs w:val="18"/>
+              </w:rPr>
+            </w:pPr>
+            <w:r>
+              <w:rPr>
+                <w:sz w:val="18"/>
+                <w:szCs w:val="18"/>
+              </w:rPr>
+              <w:t xml:space="preserve">N/A</w:t>
+            </w:r>
+          </w:p>
+        </w:tc>
+      </w:tr>
+      <w:tr>
+        <w:tc>
+          <w:tcPr>
+            <w:tcW w:w="1364" w:type="dxa"/>
+          </w:tcPr>
+          <w:p>
+            <w:pPr>
+              <w:spacing w:after="0" w:line="240" w:lineRule="auto"/>
+              <w:rPr>
+                <w:sz w:val="18"/>
+                <w:szCs w:val="18"/>
+              </w:rPr>
+            </w:pPr>
+            <w:r>
+              <w:rPr>
+                <w:color w:val="000000"/>
+                <w:sz w:val="18"/>
+                <w:szCs w:val="18"/>
+              </w:rPr>
+              <w:t>QoS KPI Obligations</w:t>
+            </w:r>
+          </w:p>
+        </w:tc>
+        <w:tc>
+          <w:tcPr>
+            <w:tcW w:w="2132" w:type="dxa"/>
+          </w:tcPr>
+          <w:p>
+            <w:pPr>
+              <w:spacing w:after="0" w:line="240" w:lineRule="auto"/>
+              <w:rPr>
+                <w:sz w:val="18"/>
+                <w:szCs w:val="18"/>
+              </w:rPr>
+            </w:pPr>
+            <w:r>
+              <w:rPr>
+                <w:sz w:val="18"/>
+                <w:szCs w:val="18"/>
+              </w:rPr>
+              <w:sym w:font="Wingdings" w:char="F070"/>
+            </w:r>
+            <w:r>
+              <w:rPr>
+                <w:sz w:val="18"/>
+                <w:szCs w:val="18"/>
+              </w:rPr>
+              <w:t xml:space="preserve">Consultation Paper</w:t>
+            </w:r>
+          </w:p>
+          <w:p>
+            <w:pPr>
+              <w:spacing w:after="0" w:line="240" w:lineRule="auto"/>
+              <w:rPr>
+                <w:sz w:val="18"/>
+                <w:szCs w:val="18"/>
+              </w:rPr>
+            </w:pPr>
+            <w:r>
+              <w:rPr>
+                <w:sz w:val="18"/>
+                <w:szCs w:val="18"/>
+              </w:rPr>
+              <w:sym w:font="Wingdings" w:char="F070"/>
+            </w:r>
+            <w:r>
+              <w:rPr>
+                <w:sz w:val="18"/>
+                <w:szCs w:val="18"/>
+              </w:rPr>
+              <w:t xml:space="preserve">Initial Talks</w:t>
+            </w:r>
+          </w:p>
+          <w:p>
+            <w:pPr>
+              <w:spacing w:after="0" w:line="240" w:lineRule="auto"/>
+              <w:rPr>
+                <w:sz w:val="18"/>
+                <w:szCs w:val="18"/>
+              </w:rPr>
+            </w:pPr>
+            <w:r>
+              <w:rPr>
+                <w:sz w:val="18"/>
+                <w:szCs w:val="18"/>
+              </w:rPr>
+              <w:sym w:font="Wingdings" w:char="F070"/>
+            </w:r>
+            <w:r>
+              <w:rPr>
+                <w:sz w:val="18"/>
+                <w:szCs w:val="18"/>
+              </w:rPr>
+              <w:t xml:space="preserve">Policy Document</w:t>
+            </w:r>
+          </w:p>
+          <w:p>
+            <w:pPr>
+              <w:spacing w:after="0" w:line="240" w:lineRule="auto"/>
+              <w:rPr>
+                <w:sz w:val="18"/>
+                <w:szCs w:val="18"/>
+              </w:rPr>
+            </w:pPr>
+            <w:r>
+              <w:rPr>
+                <w:b/>
+                <w:bCs/>
+                <w:sz w:val="18"/>
+                <w:szCs w:val="18"/>
+              </w:rPr>
+              <w:sym w:font="Wingdings" w:char="F0FE"/>
+            </w:r>
+            <w:r>
+              <w:rPr>
+                <w:b/>
+                <w:bCs/>
+                <w:sz w:val="18"/>
+                <w:szCs w:val="18"/>
+              </w:rPr>
+              <w:t xml:space="preserve">Regulation/Directives</w:t>
+            </w:r>
+          </w:p>
+          <w:p>
+            <w:pPr>
+              <w:spacing w:after="0" w:line="240" w:lineRule="auto"/>
+              <w:rPr>
+                <w:sz w:val="18"/>
+                <w:szCs w:val="18"/>
+              </w:rPr>
+            </w:pPr>
+            <w:r>
+              <w:rPr>
+                <w:sz w:val="18"/>
+                <w:szCs w:val="18"/>
+              </w:rPr>
+              <w:sym w:font="Wingdings" w:char="F070"/>
+            </w:r>
+            <w:r>
+              <w:rPr>
+                <w:sz w:val="18"/>
+                <w:szCs w:val="18"/>
+              </w:rPr>
+              <w:t xml:space="preserve">Recommendation of Regulator (NRA)</w:t>
+            </w:r>
+          </w:p>
+          <w:p>
+            <w:pPr>
+              <w:spacing w:after="0" w:line="240" w:lineRule="auto"/>
+              <w:rPr>
+                <w:sz w:val="18"/>
+                <w:szCs w:val="18"/>
+              </w:rPr>
+            </w:pPr>
+            <w:r>
+              <w:rPr>
+                <w:sz w:val="18"/>
+                <w:szCs w:val="18"/>
+              </w:rPr>
+              <w:sym w:font="Wingdings" w:char="F070"/>
+            </w:r>
+            <w:r>
+              <w:rPr>
+                <w:sz w:val="18"/>
+                <w:szCs w:val="18"/>
+              </w:rPr>
+              <w:t xml:space="preserve">Court Orders</w:t>
+            </w:r>
+          </w:p>
+          <w:p>
+            <w:pPr>
+              <w:spacing w:after="0" w:line="240" w:lineRule="auto"/>
+              <w:rPr>
+                <w:sz w:val="18"/>
+                <w:szCs w:val="18"/>
+              </w:rPr>
+            </w:pPr>
+            <w:r>
+              <w:rPr>
+                <w:sz w:val="18"/>
+                <w:szCs w:val="18"/>
+              </w:rPr>
+              <w:sym w:font="Wingdings" w:char="F070"/>
+            </w:r>
+            <w:r>
+              <w:rPr>
+                <w:sz w:val="18"/>
+                <w:szCs w:val="18"/>
+              </w:rPr>
+              <w:t xml:space="preserve">MOU between Operator</w:t>
+            </w:r>
+          </w:p>
+          <w:p>
+            <w:pPr>
+              <w:spacing w:after="0" w:line="240" w:lineRule="auto"/>
+              <w:rPr>
+                <w:sz w:val="18"/>
+                <w:szCs w:val="18"/>
+              </w:rPr>
+            </w:pPr>
+            <w:r>
+              <w:rPr>
+                <w:sz w:val="18"/>
+                <w:szCs w:val="18"/>
+              </w:rPr>
+              <w:sym w:font="Wingdings" w:char="F070"/>
+            </w:r>
+            <w:r>
+              <w:rPr>
+                <w:sz w:val="18"/>
+                <w:szCs w:val="18"/>
+              </w:rPr>
+              <w:t xml:space="preserve">NRA Compliance Notice</w:t>
+            </w:r>
+          </w:p>
+          <w:p>
+            <w:pPr>
+              <w:spacing w:after="0" w:line="240" w:lineRule="auto"/>
+              <w:rPr>
+                <w:sz w:val="18"/>
+                <w:szCs w:val="18"/>
+              </w:rPr>
+            </w:pPr>
+            <w:r>
+              <w:rPr>
+                <w:sz w:val="18"/>
+                <w:szCs w:val="18"/>
+              </w:rPr>
+              <w:sym w:font="Wingdings" w:char="F070"/>
+            </w:r>
+            <w:r>
+              <w:rPr>
+                <w:sz w:val="18"/>
+                <w:szCs w:val="18"/>
+              </w:rPr>
+              <w:t xml:space="preserve">Licensing Amendment</w:t>
+            </w:r>
+          </w:p>
+          <w:p>
+            <w:pPr>
+              <w:spacing w:after="0" w:line="240" w:lineRule="auto"/>
+              <w:rPr>
+                <w:sz w:val="18"/>
+                <w:szCs w:val="18"/>
+              </w:rPr>
+            </w:pPr>
+            <w:r>
+              <w:rPr>
+                <w:b/>
+                <w:bCs/>
+                <w:sz w:val="18"/>
+                <w:szCs w:val="18"/>
+              </w:rPr>
+              <w:sym w:font="Wingdings" w:char="F0FE"/>
+            </w:r>
+            <w:r>
+              <w:rPr>
+                <w:b/>
+                <w:bCs/>
+                <w:sz w:val="18"/>
+                <w:szCs w:val="18"/>
+              </w:rPr>
+              <w:t xml:space="preserve">Others</w:t>
+            </w:r>
+          </w:p>
+        </w:tc>
+        <w:tc>
+          <w:tcPr>
+            <w:tcW w:w="3222" w:type="dxa"/>
+          </w:tcPr>
           <w:p>
             <w:pPr>
               <w:pStyle w:val="ListParagraph"/>
@@ -2421,16 +4514,20 @@
               <w:spacing w:after="0" w:line="240" w:lineRule="auto"/>
               <w:ind w:left="216" w:hanging="216"/>
               <w:rPr>
-                <w:sz w:val="18"/>
-                <w:szCs w:val="18"/>
-              </w:rPr>
-            </w:pPr>
-            <w:r>
-              <w:rPr>
-                <w:sz w:val="18"/>
-                <w:szCs w:val="18"/>
-              </w:rPr>
-              <w:t xml:space="preserve">Geographic fixed-line (local DID) numbers with SDCA/STD codes</w:t>
+                <w:b/>
+                <w:bCs/>
+                <w:sz w:val="18"/>
+                <w:szCs w:val="18"/>
+              </w:rPr>
+            </w:pPr>
+            <w:r>
+              <w:rPr>
+                <w:b/>
+                <w:bCs/>
+                <w:sz w:val="18"/>
+                <w:szCs w:val="18"/>
+              </w:rPr>
+              <w:t xml:space="preserve">On 25 September 2026 TRAI launched the Digital Connectivity Rating (DCR) platform and a field-testing mobile app. They put into operation its framework for rating residential, commercial and government properties on in-building digital connectivity.</w:t>
             </w:r>
           </w:p>
           <w:p>
@@ -2443,16 +4540,20 @@
               <w:spacing w:after="0" w:line="240" w:lineRule="auto"/>
               <w:ind w:left="216" w:hanging="216"/>
               <w:rPr>
-                <w:sz w:val="18"/>
-                <w:szCs w:val="18"/>
-              </w:rPr>
-            </w:pPr>
-            <w:r>
-              <w:rPr>
-                <w:sz w:val="18"/>
-                <w:szCs w:val="18"/>
-              </w:rPr>
-              <w:t xml:space="preserve">10-digit mobile numbers (starting 6, 7, 8 or 9)</w:t>
+                <w:b/>
+                <w:bCs/>
+                <w:sz w:val="18"/>
+                <w:szCs w:val="18"/>
+              </w:rPr>
+            </w:pPr>
+            <w:r>
+              <w:rPr>
+                <w:b/>
+                <w:bCs/>
+                <w:sz w:val="18"/>
+                <w:szCs w:val="18"/>
+              </w:rPr>
+              <w:t xml:space="preserve">The platform brings together property managers, registered Digital Connectivity Rating Agencies (DCRAs) and consumers. Ratings cover fibre readiness, mobile network (4G/5G) availability, in-building solutions and Wi-Fi. Certificates are digitally signed and can be verified by QR code.</w:t>
             </w:r>
           </w:p>
           <w:p>
@@ -2465,2238 +4566,20 @@
               <w:spacing w:after="0" w:line="240" w:lineRule="auto"/>
               <w:ind w:left="216" w:hanging="216"/>
               <w:rPr>
-                <w:sz w:val="18"/>
-                <w:szCs w:val="18"/>
-              </w:rPr>
-            </w:pPr>
-            <w:r>
-              <w:rPr>
-                <w:sz w:val="18"/>
-                <w:szCs w:val="18"/>
-              </w:rPr>
-              <w:t xml:space="preserve">Non-geographic numbers</w:t>
-            </w:r>
-          </w:p>
-          <w:p>
-            <w:pPr>
-              <w:pStyle w:val="ListParagraph"/>
-              <w:numPr>
-                <w:ilvl w:val="0"/>
-                <w:numId w:val="4"/>
-              </w:numPr>
-              <w:spacing w:after="0" w:line="240" w:lineRule="auto"/>
-              <w:ind w:left="216" w:hanging="216"/>
-              <w:rPr>
-                <w:sz w:val="18"/>
-                <w:szCs w:val="18"/>
-              </w:rPr>
-            </w:pPr>
-            <w:r>
-              <w:rPr>
-                <w:sz w:val="18"/>
-                <w:szCs w:val="18"/>
-              </w:rPr>
-              <w:t xml:space="preserve">Domestic toll-free numbers (1800) and International Toll-Free Service (ITFS, 000800)</w:t>
-            </w:r>
-          </w:p>
-          <w:p>
-            <w:pPr>
-              <w:pStyle w:val="ListParagraph"/>
-              <w:numPr>
-                <w:ilvl w:val="0"/>
-                <w:numId w:val="4"/>
-              </w:numPr>
-              <w:spacing w:after="0" w:line="240" w:lineRule="auto"/>
-              <w:ind w:left="216" w:hanging="216"/>
-              <w:rPr>
-                <w:sz w:val="18"/>
-                <w:szCs w:val="18"/>
-              </w:rPr>
-            </w:pPr>
-            <w:r>
-              <w:rPr>
-                <w:sz w:val="18"/>
-                <w:szCs w:val="18"/>
-              </w:rPr>
-              <w:t xml:space="preserve">140-series numbers for promotional calls and 1600-series numbers for service/transactional calls</w:t>
-            </w:r>
-          </w:p>
-          <w:p>
-            <w:pPr>
-              <w:pStyle w:val="ListParagraph"/>
-              <w:numPr>
-                <w:ilvl w:val="0"/>
-                <w:numId w:val="4"/>
-              </w:numPr>
-              <w:spacing w:after="0" w:line="240" w:lineRule="auto"/>
-              <w:ind w:left="216" w:hanging="216"/>
-              <w:rPr>
-                <w:sz w:val="18"/>
-                <w:szCs w:val="18"/>
-              </w:rPr>
-            </w:pPr>
-            <w:r>
-              <w:rPr>
-                <w:sz w:val="18"/>
-                <w:szCs w:val="18"/>
-              </w:rPr>
-              <w:t xml:space="preserve">Internet telephony numbers</w:t>
-            </w:r>
-          </w:p>
-        </w:tc>
-        <w:tc>
-          <w:tcPr>
-            <w:tcW w:w="2349" w:type="dxa"/>
-          </w:tcPr>
-          <w:p>
-            <w:pPr>
-              <w:spacing w:after="0" w:line="240" w:lineRule="auto"/>
-              <w:rPr>
-                <w:sz w:val="18"/>
-                <w:szCs w:val="18"/>
-              </w:rPr>
-            </w:pPr>
-            <w:r>
-              <w:rPr>
-                <w:sz w:val="18"/>
-                <w:szCs w:val="18"/>
-              </w:rPr>
-              <w:sym w:font="Wingdings" w:char="F070"/>
-            </w:r>
-            <w:r>
-              <w:rPr>
-                <w:sz w:val="18"/>
-                <w:szCs w:val="18"/>
-              </w:rPr>
-              <w:t xml:space="preserve">Website</w:t>
-            </w:r>
-          </w:p>
-          <w:p>
-            <w:pPr>
-              <w:spacing w:after="0" w:line="240" w:lineRule="auto"/>
-              <w:rPr>
-                <w:sz w:val="18"/>
-                <w:szCs w:val="18"/>
-              </w:rPr>
-            </w:pPr>
-            <w:r>
-              <w:rPr>
-                <w:sz w:val="18"/>
-                <w:szCs w:val="18"/>
-              </w:rPr>
-              <w:sym w:font="Wingdings" w:char="F070"/>
-            </w:r>
-            <w:r>
-              <w:rPr>
-                <w:sz w:val="18"/>
-                <w:szCs w:val="18"/>
-              </w:rPr>
-              <w:t xml:space="preserve">Regulator/ITU</w:t>
-            </w:r>
-          </w:p>
-          <w:p>
-            <w:pPr>
-              <w:spacing w:after="0" w:line="240" w:lineRule="auto"/>
-              <w:rPr>
-                <w:sz w:val="18"/>
-                <w:szCs w:val="18"/>
-              </w:rPr>
-            </w:pPr>
-            <w:r>
-              <w:rPr>
-                <w:sz w:val="18"/>
-                <w:szCs w:val="18"/>
-              </w:rPr>
-              <w:sym w:font="Wingdings" w:char="F070"/>
-            </w:r>
-            <w:r>
-              <w:rPr>
-                <w:sz w:val="18"/>
-                <w:szCs w:val="18"/>
-              </w:rPr>
-              <w:t xml:space="preserve">Industry Publications</w:t>
-            </w:r>
-          </w:p>
-          <w:p>
-            <w:pPr>
-              <w:spacing w:after="0" w:line="240" w:lineRule="auto"/>
-              <w:rPr>
-                <w:sz w:val="18"/>
-                <w:szCs w:val="18"/>
-              </w:rPr>
-            </w:pPr>
-            <w:r>
-              <w:rPr>
-                <w:sz w:val="18"/>
-                <w:szCs w:val="18"/>
-              </w:rPr>
-              <w:sym w:font="Wingdings" w:char="F070"/>
-            </w:r>
-            <w:r>
-              <w:rPr>
-                <w:sz w:val="18"/>
-                <w:szCs w:val="18"/>
-              </w:rPr>
-              <w:t xml:space="preserve">News Media</w:t>
-            </w:r>
-          </w:p>
-          <w:p>
-            <w:pPr>
-              <w:spacing w:after="0" w:line="240" w:lineRule="auto"/>
-              <w:rPr>
-                <w:sz w:val="18"/>
-                <w:szCs w:val="18"/>
-              </w:rPr>
-            </w:pPr>
-            <w:r>
-              <w:rPr>
-                <w:sz w:val="18"/>
-                <w:szCs w:val="18"/>
-              </w:rPr>
-              <w:sym w:font="Wingdings" w:char="F070"/>
-            </w:r>
-            <w:r>
-              <w:rPr>
-                <w:sz w:val="18"/>
-                <w:szCs w:val="18"/>
-              </w:rPr>
-              <w:t xml:space="preserve">Other Operators</w:t>
-            </w:r>
-          </w:p>
-          <w:p>
-            <w:pPr>
-              <w:spacing w:after="0" w:line="240" w:lineRule="auto"/>
-              <w:rPr>
-                <w:sz w:val="18"/>
-                <w:szCs w:val="18"/>
-              </w:rPr>
-            </w:pPr>
-            <w:r>
-              <w:rPr>
-                <w:sz w:val="18"/>
-                <w:szCs w:val="18"/>
-              </w:rPr>
-              <w:sym w:font="Wingdings" w:char="F070"/>
-            </w:r>
-            <w:r>
-              <w:rPr>
-                <w:sz w:val="18"/>
-                <w:szCs w:val="18"/>
-              </w:rPr>
-              <w:t xml:space="preserve">Online Portals/Databases</w:t>
-            </w:r>
-          </w:p>
-          <w:p>
-            <w:pPr>
-              <w:spacing w:after="0" w:line="240" w:lineRule="auto"/>
-              <w:rPr>
-                <w:sz w:val="18"/>
-                <w:szCs w:val="18"/>
-              </w:rPr>
-            </w:pPr>
-            <w:r>
-              <w:rPr>
-                <w:sz w:val="18"/>
-                <w:szCs w:val="18"/>
-              </w:rPr>
-              <w:sym w:font="Wingdings" w:char="F070"/>
-            </w:r>
-            <w:r>
-              <w:rPr>
-                <w:sz w:val="18"/>
-                <w:szCs w:val="18"/>
-              </w:rPr>
-              <w:t xml:space="preserve">Other source</w:t>
-            </w:r>
-          </w:p>
-        </w:tc>
-        <w:tc>
-          <w:tcPr>
-            <w:tcW w:w="1120" w:type="dxa"/>
-          </w:tcPr>
-          <w:p>
-            <w:pPr>
-              <w:spacing w:after="0" w:line="240" w:lineRule="auto"/>
-              <w:jc w:val="center"/>
-              <w:rPr>
-                <w:b/>
-                <w:bCs/>
-                <w:sz w:val="18"/>
-                <w:szCs w:val="18"/>
-              </w:rPr>
-            </w:pPr>
-            <w:r>
-              <w:rPr>
-                <w:b/>
-                <w:bCs/>
-                <w:sz w:val="18"/>
-                <w:szCs w:val="18"/>
-              </w:rPr>
-              <w:t xml:space="preserve">N/A</w:t>
-            </w:r>
-          </w:p>
-        </w:tc>
-        <w:tc>
-          <w:tcPr>
-            <w:tcW w:w="1691" w:type="dxa"/>
-          </w:tcPr>
-          <w:p>
-            <w:pPr>
-              <w:spacing w:after="0" w:line="240" w:lineRule="auto"/>
-              <w:jc w:val="center"/>
-              <w:rPr>
-                <w:sz w:val="18"/>
-                <w:szCs w:val="18"/>
-              </w:rPr>
-            </w:pPr>
-            <w:r>
-              <w:rPr>
-                <w:sz w:val="18"/>
-                <w:szCs w:val="18"/>
-              </w:rPr>
-              <w:t xml:space="preserve">N/A</w:t>
-            </w:r>
-          </w:p>
-        </w:tc>
-        <w:tc>
-          <w:tcPr>
-            <w:tcW w:w="2270" w:type="dxa"/>
-          </w:tcPr>
-          <w:p>
-            <w:pPr>
-              <w:spacing w:after="0" w:line="240" w:lineRule="auto"/>
-              <w:rPr>
-                <w:sz w:val="18"/>
-                <w:szCs w:val="18"/>
-              </w:rPr>
-            </w:pPr>
-            <w:hyperlink r:id="rId105" w:history="1">
-              <w:r>
-                <w:rPr>
-                  <w:rStyle w:val="Hyperlink"/>
-                  <w:color w:val="0563C1"/>
-                  <w:u w:val="single"/>
-                  <w:sz w:val="18"/>
-                  <w:szCs w:val="18"/>
-                </w:rPr>
-                <w:t xml:space="preserve">https://www.dot.gov.in/static/uploads/2026/05/9ed5f19dbf38307edc38a54377d82cd5.pdf</w:t>
-              </w:r>
-            </w:hyperlink>
-          </w:p>
-        </w:tc>
-      </w:tr>
-      <w:tr>
-        <w:tc>
-          <w:tcPr>
-            <w:tcW w:w="1364" w:type="dxa"/>
-          </w:tcPr>
-          <w:p>
-            <w:pPr>
-              <w:spacing w:after="0" w:line="240" w:lineRule="auto"/>
-              <w:rPr>
-                <w:sz w:val="18"/>
-                <w:szCs w:val="18"/>
-              </w:rPr>
-            </w:pPr>
-            <w:r>
-              <w:rPr>
-                <w:color w:val="000000"/>
-                <w:sz w:val="18"/>
-                <w:szCs w:val="18"/>
-              </w:rPr>
-              <w:t>Number Porting Obligations</w:t>
-            </w:r>
-          </w:p>
-        </w:tc>
-        <w:tc>
-          <w:tcPr>
-            <w:tcW w:w="2132" w:type="dxa"/>
-          </w:tcPr>
-          <w:p>
-            <w:pPr>
-              <w:spacing w:after="0" w:line="240" w:lineRule="auto"/>
-              <w:rPr>
-                <w:sz w:val="18"/>
-                <w:szCs w:val="18"/>
-              </w:rPr>
-            </w:pPr>
-            <w:r>
-              <w:rPr>
-                <w:sz w:val="18"/>
-                <w:szCs w:val="18"/>
-              </w:rPr>
-              <w:sym w:font="Wingdings" w:char="F070"/>
-            </w:r>
-            <w:r>
-              <w:rPr>
-                <w:sz w:val="18"/>
-                <w:szCs w:val="18"/>
-              </w:rPr>
-              <w:t xml:space="preserve">Consultation Paper</w:t>
-            </w:r>
-          </w:p>
-          <w:p>
-            <w:pPr>
-              <w:spacing w:after="0" w:line="240" w:lineRule="auto"/>
-              <w:rPr>
-                <w:sz w:val="18"/>
-                <w:szCs w:val="18"/>
-              </w:rPr>
-            </w:pPr>
-            <w:r>
-              <w:rPr>
-                <w:sz w:val="18"/>
-                <w:szCs w:val="18"/>
-              </w:rPr>
-              <w:sym w:font="Wingdings" w:char="F070"/>
-            </w:r>
-            <w:r>
-              <w:rPr>
-                <w:sz w:val="18"/>
-                <w:szCs w:val="18"/>
-              </w:rPr>
-              <w:t xml:space="preserve">Initial Talks</w:t>
-            </w:r>
-          </w:p>
-          <w:p>
-            <w:pPr>
-              <w:spacing w:after="0" w:line="240" w:lineRule="auto"/>
-              <w:rPr>
-                <w:sz w:val="18"/>
-                <w:szCs w:val="18"/>
-              </w:rPr>
-            </w:pPr>
-            <w:r>
-              <w:rPr>
-                <w:sz w:val="18"/>
-                <w:szCs w:val="18"/>
-              </w:rPr>
-              <w:sym w:font="Wingdings" w:char="F070"/>
-            </w:r>
-            <w:r>
-              <w:rPr>
-                <w:sz w:val="18"/>
-                <w:szCs w:val="18"/>
-              </w:rPr>
-              <w:t xml:space="preserve">Policy Document</w:t>
-            </w:r>
-          </w:p>
-          <w:p>
-            <w:pPr>
-              <w:spacing w:after="0" w:line="240" w:lineRule="auto"/>
-              <w:rPr>
-                <w:sz w:val="18"/>
-                <w:szCs w:val="18"/>
-              </w:rPr>
-            </w:pPr>
-            <w:r>
-              <w:rPr>
-                <w:sz w:val="18"/>
-                <w:szCs w:val="18"/>
-              </w:rPr>
-              <w:sym w:font="Wingdings" w:char="F070"/>
-            </w:r>
-            <w:r>
-              <w:rPr>
-                <w:sz w:val="18"/>
-                <w:szCs w:val="18"/>
-              </w:rPr>
-              <w:t xml:space="preserve">Regulation/Directives</w:t>
-            </w:r>
-          </w:p>
-          <w:p>
-            <w:pPr>
-              <w:spacing w:after="0" w:line="240" w:lineRule="auto"/>
-              <w:rPr>
-                <w:sz w:val="18"/>
-                <w:szCs w:val="18"/>
-              </w:rPr>
-            </w:pPr>
-            <w:r>
-              <w:rPr>
-                <w:sz w:val="18"/>
-                <w:szCs w:val="18"/>
-              </w:rPr>
-              <w:sym w:font="Wingdings" w:char="F070"/>
-            </w:r>
-            <w:r>
-              <w:rPr>
-                <w:sz w:val="18"/>
-                <w:szCs w:val="18"/>
-              </w:rPr>
-              <w:t xml:space="preserve">Recommendation of Regulator (NRA)</w:t>
-            </w:r>
-          </w:p>
-          <w:p>
-            <w:pPr>
-              <w:spacing w:after="0" w:line="240" w:lineRule="auto"/>
-              <w:rPr>
-                <w:sz w:val="18"/>
-                <w:szCs w:val="18"/>
-              </w:rPr>
-            </w:pPr>
-            <w:r>
-              <w:rPr>
-                <w:sz w:val="18"/>
-                <w:szCs w:val="18"/>
-              </w:rPr>
-              <w:sym w:font="Wingdings" w:char="F070"/>
-            </w:r>
-            <w:r>
-              <w:rPr>
-                <w:sz w:val="18"/>
-                <w:szCs w:val="18"/>
-              </w:rPr>
-              <w:t xml:space="preserve">Court Orders</w:t>
-            </w:r>
-          </w:p>
-          <w:p>
-            <w:pPr>
-              <w:spacing w:after="0" w:line="240" w:lineRule="auto"/>
-              <w:rPr>
-                <w:sz w:val="18"/>
-                <w:szCs w:val="18"/>
-              </w:rPr>
-            </w:pPr>
-            <w:r>
-              <w:rPr>
-                <w:sz w:val="18"/>
-                <w:szCs w:val="18"/>
-              </w:rPr>
-              <w:sym w:font="Wingdings" w:char="F070"/>
-            </w:r>
-            <w:r>
-              <w:rPr>
-                <w:sz w:val="18"/>
-                <w:szCs w:val="18"/>
-              </w:rPr>
-              <w:t xml:space="preserve">MOU between Operator</w:t>
-            </w:r>
-          </w:p>
-          <w:p>
-            <w:pPr>
-              <w:spacing w:after="0" w:line="240" w:lineRule="auto"/>
-              <w:rPr>
-                <w:sz w:val="18"/>
-                <w:szCs w:val="18"/>
-              </w:rPr>
-            </w:pPr>
-            <w:r>
-              <w:rPr>
-                <w:sz w:val="18"/>
-                <w:szCs w:val="18"/>
-              </w:rPr>
-              <w:sym w:font="Wingdings" w:char="F070"/>
-            </w:r>
-            <w:r>
-              <w:rPr>
-                <w:sz w:val="18"/>
-                <w:szCs w:val="18"/>
-              </w:rPr>
-              <w:t xml:space="preserve">NRA Compliance Notice</w:t>
-            </w:r>
-          </w:p>
-          <w:p>
-            <w:pPr>
-              <w:spacing w:after="0" w:line="240" w:lineRule="auto"/>
-              <w:rPr>
-                <w:sz w:val="18"/>
-                <w:szCs w:val="18"/>
-              </w:rPr>
-            </w:pPr>
-            <w:r>
-              <w:rPr>
-                <w:sz w:val="18"/>
-                <w:szCs w:val="18"/>
-              </w:rPr>
-              <w:sym w:font="Wingdings" w:char="F070"/>
-            </w:r>
-            <w:r>
-              <w:rPr>
-                <w:sz w:val="18"/>
-                <w:szCs w:val="18"/>
-              </w:rPr>
-              <w:t xml:space="preserve">Licensing Amendment</w:t>
-            </w:r>
-          </w:p>
-          <w:p>
-            <w:pPr>
-              <w:spacing w:after="0" w:line="240" w:lineRule="auto"/>
-              <w:rPr>
-                <w:sz w:val="18"/>
-                <w:szCs w:val="18"/>
-              </w:rPr>
-            </w:pPr>
-            <w:r>
-              <w:rPr>
-                <w:sz w:val="18"/>
-                <w:szCs w:val="18"/>
-              </w:rPr>
-              <w:sym w:font="Wingdings" w:char="F070"/>
-            </w:r>
-            <w:r>
-              <w:rPr>
-                <w:sz w:val="18"/>
-                <w:szCs w:val="18"/>
-              </w:rPr>
-              <w:t xml:space="preserve">Others</w:t>
-            </w:r>
-          </w:p>
-        </w:tc>
-        <w:tc>
-          <w:tcPr>
-            <w:tcW w:w="3222" w:type="dxa"/>
-          </w:tcPr>
-          <w:p>
-            <w:pPr>
-              <w:spacing w:after="0" w:line="240" w:lineRule="auto"/>
-              <w:jc w:val="center"/>
-              <w:rPr>
-                <w:b/>
-                <w:bCs/>
-                <w:sz w:val="18"/>
-                <w:szCs w:val="18"/>
-              </w:rPr>
-            </w:pPr>
-            <w:r>
-              <w:rPr>
-                <w:b/>
-                <w:bCs/>
-                <w:sz w:val="18"/>
-                <w:szCs w:val="18"/>
-              </w:rPr>
-              <w:t xml:space="preserve">“NO NEW NUMBER PORTING DEVELOPMENTS”</w:t>
-            </w:r>
-          </w:p>
-        </w:tc>
-        <w:tc>
-          <w:tcPr>
-            <w:tcW w:w="2349" w:type="dxa"/>
-          </w:tcPr>
-          <w:p>
-            <w:pPr>
-              <w:spacing w:after="0" w:line="240" w:lineRule="auto"/>
-              <w:rPr>
-                <w:sz w:val="18"/>
-                <w:szCs w:val="18"/>
-              </w:rPr>
-            </w:pPr>
-            <w:r>
-              <w:rPr>
-                <w:sz w:val="18"/>
-                <w:szCs w:val="18"/>
-              </w:rPr>
-              <w:sym w:font="Wingdings" w:char="F070"/>
-            </w:r>
-            <w:r>
-              <w:rPr>
-                <w:sz w:val="18"/>
-                <w:szCs w:val="18"/>
-              </w:rPr>
-              <w:t xml:space="preserve">Website</w:t>
-            </w:r>
-          </w:p>
-          <w:p>
-            <w:pPr>
-              <w:spacing w:after="0" w:line="240" w:lineRule="auto"/>
-              <w:rPr>
-                <w:sz w:val="18"/>
-                <w:szCs w:val="18"/>
-              </w:rPr>
-            </w:pPr>
-            <w:r>
-              <w:rPr>
-                <w:sz w:val="18"/>
-                <w:szCs w:val="18"/>
-              </w:rPr>
-              <w:sym w:font="Wingdings" w:char="F070"/>
-            </w:r>
-            <w:r>
-              <w:rPr>
-                <w:sz w:val="18"/>
-                <w:szCs w:val="18"/>
-              </w:rPr>
-              <w:t xml:space="preserve">Regulator/ITU</w:t>
-            </w:r>
-          </w:p>
-          <w:p>
-            <w:pPr>
-              <w:spacing w:after="0" w:line="240" w:lineRule="auto"/>
-              <w:rPr>
-                <w:sz w:val="18"/>
-                <w:szCs w:val="18"/>
-              </w:rPr>
-            </w:pPr>
-            <w:r>
-              <w:rPr>
-                <w:sz w:val="18"/>
-                <w:szCs w:val="18"/>
-              </w:rPr>
-              <w:sym w:font="Wingdings" w:char="F070"/>
-            </w:r>
-            <w:r>
-              <w:rPr>
-                <w:sz w:val="18"/>
-                <w:szCs w:val="18"/>
-              </w:rPr>
-              <w:t xml:space="preserve">Industry Publications</w:t>
-            </w:r>
-          </w:p>
-          <w:p>
-            <w:pPr>
-              <w:spacing w:after="0" w:line="240" w:lineRule="auto"/>
-              <w:rPr>
-                <w:sz w:val="18"/>
-                <w:szCs w:val="18"/>
-              </w:rPr>
-            </w:pPr>
-            <w:r>
-              <w:rPr>
-                <w:sz w:val="18"/>
-                <w:szCs w:val="18"/>
-              </w:rPr>
-              <w:sym w:font="Wingdings" w:char="F070"/>
-            </w:r>
-            <w:r>
-              <w:rPr>
-                <w:sz w:val="18"/>
-                <w:szCs w:val="18"/>
-              </w:rPr>
-              <w:t xml:space="preserve">News Media</w:t>
-            </w:r>
-          </w:p>
-          <w:p>
-            <w:pPr>
-              <w:spacing w:after="0" w:line="240" w:lineRule="auto"/>
-              <w:rPr>
-                <w:sz w:val="18"/>
-                <w:szCs w:val="18"/>
-              </w:rPr>
-            </w:pPr>
-            <w:r>
-              <w:rPr>
-                <w:sz w:val="18"/>
-                <w:szCs w:val="18"/>
-              </w:rPr>
-              <w:sym w:font="Wingdings" w:char="F070"/>
-            </w:r>
-            <w:r>
-              <w:rPr>
-                <w:sz w:val="18"/>
-                <w:szCs w:val="18"/>
-              </w:rPr>
-              <w:t xml:space="preserve">Other Operators</w:t>
-            </w:r>
-          </w:p>
-          <w:p>
-            <w:pPr>
-              <w:spacing w:after="0" w:line="240" w:lineRule="auto"/>
-              <w:rPr>
-                <w:sz w:val="18"/>
-                <w:szCs w:val="18"/>
-              </w:rPr>
-            </w:pPr>
-            <w:r>
-              <w:rPr>
-                <w:sz w:val="18"/>
-                <w:szCs w:val="18"/>
-              </w:rPr>
-              <w:sym w:font="Wingdings" w:char="F070"/>
-            </w:r>
-            <w:r>
-              <w:rPr>
-                <w:sz w:val="18"/>
-                <w:szCs w:val="18"/>
-              </w:rPr>
-              <w:t xml:space="preserve">Online Portals/Databases</w:t>
-            </w:r>
-          </w:p>
-          <w:p>
-            <w:pPr>
-              <w:spacing w:after="0" w:line="240" w:lineRule="auto"/>
-              <w:rPr>
-                <w:sz w:val="18"/>
-                <w:szCs w:val="18"/>
-              </w:rPr>
-            </w:pPr>
-            <w:r>
-              <w:rPr>
-                <w:sz w:val="18"/>
-                <w:szCs w:val="18"/>
-              </w:rPr>
-              <w:sym w:font="Wingdings" w:char="F070"/>
-            </w:r>
-            <w:r>
-              <w:rPr>
-                <w:sz w:val="18"/>
-                <w:szCs w:val="18"/>
-              </w:rPr>
-              <w:t xml:space="preserve">Other source</w:t>
-            </w:r>
-          </w:p>
-        </w:tc>
-        <w:tc>
-          <w:tcPr>
-            <w:tcW w:w="1120" w:type="dxa"/>
-          </w:tcPr>
-          <w:p>
-            <w:pPr>
-              <w:spacing w:after="0" w:line="240" w:lineRule="auto"/>
-              <w:jc w:val="center"/>
-              <w:rPr>
-                <w:b/>
-                <w:bCs/>
-                <w:sz w:val="18"/>
-                <w:szCs w:val="18"/>
-              </w:rPr>
-            </w:pPr>
-            <w:r>
-              <w:rPr>
-                <w:b/>
-                <w:bCs/>
-                <w:sz w:val="18"/>
-                <w:szCs w:val="18"/>
-              </w:rPr>
-              <w:t xml:space="preserve">N/A</w:t>
-            </w:r>
-          </w:p>
-        </w:tc>
-        <w:tc>
-          <w:tcPr>
-            <w:tcW w:w="1691" w:type="dxa"/>
-          </w:tcPr>
-          <w:p>
-            <w:pPr>
-              <w:spacing w:after="0" w:line="240" w:lineRule="auto"/>
-              <w:jc w:val="center"/>
-              <w:rPr>
-                <w:sz w:val="18"/>
-                <w:szCs w:val="18"/>
-              </w:rPr>
-            </w:pPr>
-            <w:r>
-              <w:rPr>
-                <w:sz w:val="18"/>
-                <w:szCs w:val="18"/>
-              </w:rPr>
-              <w:t xml:space="preserve">N/A</w:t>
-            </w:r>
-          </w:p>
-        </w:tc>
-        <w:tc>
-          <w:tcPr>
-            <w:tcW w:w="2270" w:type="dxa"/>
-          </w:tcPr>
-          <w:p>
-            <w:pPr>
-              <w:spacing w:after="0" w:line="240" w:lineRule="auto"/>
-              <w:jc w:val="center"/>
-              <w:rPr>
-                <w:sz w:val="18"/>
-                <w:szCs w:val="18"/>
-              </w:rPr>
-            </w:pPr>
-            <w:r>
-              <w:rPr>
-                <w:sz w:val="18"/>
-                <w:szCs w:val="18"/>
-              </w:rPr>
-              <w:t xml:space="preserve">N/A</w:t>
-            </w:r>
-          </w:p>
-        </w:tc>
-      </w:tr>
-      <w:tr>
-        <w:tc>
-          <w:tcPr>
-            <w:tcW w:w="1364" w:type="dxa"/>
-          </w:tcPr>
-          <w:p>
-            <w:pPr>
-              <w:spacing w:after="0" w:line="240" w:lineRule="auto"/>
-              <w:rPr>
-                <w:rFonts w:ascii="Calibri" w:hAnsi="Calibri" w:cs="Calibri"/>
-                <w:color w:val="000000"/>
-                <w:sz w:val="18"/>
-                <w:szCs w:val="18"/>
-              </w:rPr>
-            </w:pPr>
-            <w:r>
-              <w:rPr>
-                <w:color w:val="000000"/>
-                <w:sz w:val="18"/>
-                <w:szCs w:val="18"/>
-              </w:rPr>
-              <w:lastRenderedPageBreak/>
-              <w:t>Emergency Services Obligations</w:t>
-            </w:r>
-          </w:p>
-        </w:tc>
-        <w:tc>
-          <w:tcPr>
-            <w:tcW w:w="2132" w:type="dxa"/>
-          </w:tcPr>
-          <w:p>
-            <w:pPr>
-              <w:spacing w:after="0" w:line="240" w:lineRule="auto"/>
-              <w:rPr>
-                <w:sz w:val="18"/>
-                <w:szCs w:val="18"/>
-              </w:rPr>
-            </w:pPr>
-            <w:r>
-              <w:rPr>
-                <w:sz w:val="18"/>
-                <w:szCs w:val="18"/>
-              </w:rPr>
-              <w:sym w:font="Wingdings" w:char="F070"/>
-            </w:r>
-            <w:r>
-              <w:rPr>
-                <w:sz w:val="18"/>
-                <w:szCs w:val="18"/>
-              </w:rPr>
-              <w:t xml:space="preserve">Consultation Paper</w:t>
-            </w:r>
-          </w:p>
-          <w:p>
-            <w:pPr>
-              <w:spacing w:after="0" w:line="240" w:lineRule="auto"/>
-              <w:rPr>
-                <w:sz w:val="18"/>
-                <w:szCs w:val="18"/>
-              </w:rPr>
-            </w:pPr>
-            <w:r>
-              <w:rPr>
-                <w:sz w:val="18"/>
-                <w:szCs w:val="18"/>
-              </w:rPr>
-              <w:sym w:font="Wingdings" w:char="F070"/>
-            </w:r>
-            <w:r>
-              <w:rPr>
-                <w:sz w:val="18"/>
-                <w:szCs w:val="18"/>
-              </w:rPr>
-              <w:t xml:space="preserve">Initial Talks</w:t>
-            </w:r>
-          </w:p>
-          <w:p>
-            <w:pPr>
-              <w:spacing w:after="0" w:line="240" w:lineRule="auto"/>
-              <w:rPr>
-                <w:sz w:val="18"/>
-                <w:szCs w:val="18"/>
-              </w:rPr>
-            </w:pPr>
-            <w:r>
-              <w:rPr>
-                <w:sz w:val="18"/>
-                <w:szCs w:val="18"/>
-              </w:rPr>
-              <w:sym w:font="Wingdings" w:char="F070"/>
-            </w:r>
-            <w:r>
-              <w:rPr>
-                <w:sz w:val="18"/>
-                <w:szCs w:val="18"/>
-              </w:rPr>
-              <w:t xml:space="preserve">Policy Document</w:t>
-            </w:r>
-          </w:p>
-          <w:p>
-            <w:pPr>
-              <w:spacing w:after="0" w:line="240" w:lineRule="auto"/>
-              <w:rPr>
-                <w:sz w:val="18"/>
-                <w:szCs w:val="18"/>
-              </w:rPr>
-            </w:pPr>
-            <w:r>
-              <w:rPr>
-                <w:sz w:val="18"/>
-                <w:szCs w:val="18"/>
-              </w:rPr>
-              <w:sym w:font="Wingdings" w:char="F070"/>
-            </w:r>
-            <w:r>
-              <w:rPr>
-                <w:sz w:val="18"/>
-                <w:szCs w:val="18"/>
-              </w:rPr>
-              <w:t xml:space="preserve">Regulation/Directives</w:t>
-            </w:r>
-          </w:p>
-          <w:p>
-            <w:pPr>
-              <w:spacing w:after="0" w:line="240" w:lineRule="auto"/>
-              <w:rPr>
-                <w:sz w:val="18"/>
-                <w:szCs w:val="18"/>
-              </w:rPr>
-            </w:pPr>
-            <w:r>
-              <w:rPr>
-                <w:sz w:val="18"/>
-                <w:szCs w:val="18"/>
-              </w:rPr>
-              <w:sym w:font="Wingdings" w:char="F070"/>
-            </w:r>
-            <w:r>
-              <w:rPr>
-                <w:sz w:val="18"/>
-                <w:szCs w:val="18"/>
-              </w:rPr>
-              <w:t xml:space="preserve">Recommendation of Regulator (NRA)</w:t>
-            </w:r>
-          </w:p>
-          <w:p>
-            <w:pPr>
-              <w:spacing w:after="0" w:line="240" w:lineRule="auto"/>
-              <w:rPr>
-                <w:sz w:val="18"/>
-                <w:szCs w:val="18"/>
-              </w:rPr>
-            </w:pPr>
-            <w:r>
-              <w:rPr>
-                <w:sz w:val="18"/>
-                <w:szCs w:val="18"/>
-              </w:rPr>
-              <w:sym w:font="Wingdings" w:char="F070"/>
-            </w:r>
-            <w:r>
-              <w:rPr>
-                <w:sz w:val="18"/>
-                <w:szCs w:val="18"/>
-              </w:rPr>
-              <w:t xml:space="preserve">Court Orders</w:t>
-            </w:r>
-          </w:p>
-          <w:p>
-            <w:pPr>
-              <w:spacing w:after="0" w:line="240" w:lineRule="auto"/>
-              <w:rPr>
-                <w:sz w:val="18"/>
-                <w:szCs w:val="18"/>
-              </w:rPr>
-            </w:pPr>
-            <w:r>
-              <w:rPr>
-                <w:sz w:val="18"/>
-                <w:szCs w:val="18"/>
-              </w:rPr>
-              <w:sym w:font="Wingdings" w:char="F070"/>
-            </w:r>
-            <w:r>
-              <w:rPr>
-                <w:sz w:val="18"/>
-                <w:szCs w:val="18"/>
-              </w:rPr>
-              <w:t xml:space="preserve">MOU between Operator</w:t>
-            </w:r>
-          </w:p>
-          <w:p>
-            <w:pPr>
-              <w:spacing w:after="0" w:line="240" w:lineRule="auto"/>
-              <w:rPr>
-                <w:sz w:val="18"/>
-                <w:szCs w:val="18"/>
-              </w:rPr>
-            </w:pPr>
-            <w:r>
-              <w:rPr>
-                <w:sz w:val="18"/>
-                <w:szCs w:val="18"/>
-              </w:rPr>
-              <w:sym w:font="Wingdings" w:char="F070"/>
-            </w:r>
-            <w:r>
-              <w:rPr>
-                <w:sz w:val="18"/>
-                <w:szCs w:val="18"/>
-              </w:rPr>
-              <w:t xml:space="preserve">NRA Compliance Notice</w:t>
-            </w:r>
-          </w:p>
-          <w:p>
-            <w:pPr>
-              <w:spacing w:after="0" w:line="240" w:lineRule="auto"/>
-              <w:rPr>
-                <w:sz w:val="18"/>
-                <w:szCs w:val="18"/>
-              </w:rPr>
-            </w:pPr>
-            <w:r>
-              <w:rPr>
-                <w:sz w:val="18"/>
-                <w:szCs w:val="18"/>
-              </w:rPr>
-              <w:sym w:font="Wingdings" w:char="F070"/>
-            </w:r>
-            <w:r>
-              <w:rPr>
-                <w:sz w:val="18"/>
-                <w:szCs w:val="18"/>
-              </w:rPr>
-              <w:t xml:space="preserve">Licensing Amendment</w:t>
-            </w:r>
-          </w:p>
-          <w:p>
-            <w:pPr>
-              <w:spacing w:after="0" w:line="240" w:lineRule="auto"/>
-              <w:rPr>
-                <w:sz w:val="18"/>
-                <w:szCs w:val="18"/>
-              </w:rPr>
-            </w:pPr>
-            <w:r>
-              <w:rPr>
-                <w:sz w:val="18"/>
-                <w:szCs w:val="18"/>
-              </w:rPr>
-              <w:sym w:font="Wingdings" w:char="F070"/>
-            </w:r>
-            <w:r>
-              <w:rPr>
-                <w:sz w:val="18"/>
-                <w:szCs w:val="18"/>
-              </w:rPr>
-              <w:t xml:space="preserve">Others</w:t>
-            </w:r>
-          </w:p>
-        </w:tc>
-        <w:tc>
-          <w:tcPr>
-            <w:tcW w:w="3222" w:type="dxa"/>
-          </w:tcPr>
-          <w:p>
-            <w:pPr>
-              <w:spacing w:after="0" w:line="240" w:lineRule="auto"/>
-              <w:jc w:val="center"/>
-              <w:rPr>
-                <w:b/>
-                <w:bCs/>
-                <w:sz w:val="18"/>
-                <w:szCs w:val="18"/>
-              </w:rPr>
-            </w:pPr>
-            <w:r>
-              <w:rPr>
-                <w:b/>
-                <w:bCs/>
-                <w:sz w:val="18"/>
-                <w:szCs w:val="18"/>
-              </w:rPr>
-              <w:t xml:space="preserve">“NO UPDATED INFORMATION IS AVAILABLE, INFORMATION IS SAME AS EARLIER”</w:t>
-            </w:r>
-          </w:p>
-        </w:tc>
-        <w:tc>
-          <w:tcPr>
-            <w:tcW w:w="2349" w:type="dxa"/>
-          </w:tcPr>
-          <w:p>
-            <w:pPr>
-              <w:spacing w:after="0" w:line="240" w:lineRule="auto"/>
-              <w:rPr>
-                <w:sz w:val="18"/>
-                <w:szCs w:val="18"/>
-              </w:rPr>
-            </w:pPr>
-            <w:r>
-              <w:rPr>
-                <w:sz w:val="18"/>
-                <w:szCs w:val="18"/>
-              </w:rPr>
-              <w:sym w:font="Wingdings" w:char="F070"/>
-            </w:r>
-            <w:r>
-              <w:rPr>
-                <w:sz w:val="18"/>
-                <w:szCs w:val="18"/>
-              </w:rPr>
-              <w:t xml:space="preserve">Website</w:t>
-            </w:r>
-          </w:p>
-          <w:p>
-            <w:pPr>
-              <w:spacing w:after="0" w:line="240" w:lineRule="auto"/>
-              <w:rPr>
-                <w:sz w:val="18"/>
-                <w:szCs w:val="18"/>
-              </w:rPr>
-            </w:pPr>
-            <w:r>
-              <w:rPr>
-                <w:sz w:val="18"/>
-                <w:szCs w:val="18"/>
-              </w:rPr>
-              <w:sym w:font="Wingdings" w:char="F070"/>
-            </w:r>
-            <w:r>
-              <w:rPr>
-                <w:sz w:val="18"/>
-                <w:szCs w:val="18"/>
-              </w:rPr>
-              <w:t xml:space="preserve">Regulator/ITU</w:t>
-            </w:r>
-          </w:p>
-          <w:p>
-            <w:pPr>
-              <w:spacing w:after="0" w:line="240" w:lineRule="auto"/>
-              <w:rPr>
-                <w:sz w:val="18"/>
-                <w:szCs w:val="18"/>
-              </w:rPr>
-            </w:pPr>
-            <w:r>
-              <w:rPr>
-                <w:sz w:val="18"/>
-                <w:szCs w:val="18"/>
-              </w:rPr>
-              <w:sym w:font="Wingdings" w:char="F070"/>
-            </w:r>
-            <w:r>
-              <w:rPr>
-                <w:sz w:val="18"/>
-                <w:szCs w:val="18"/>
-              </w:rPr>
-              <w:t xml:space="preserve">Industry Publications</w:t>
-            </w:r>
-          </w:p>
-          <w:p>
-            <w:pPr>
-              <w:spacing w:after="0" w:line="240" w:lineRule="auto"/>
-              <w:rPr>
-                <w:sz w:val="18"/>
-                <w:szCs w:val="18"/>
-              </w:rPr>
-            </w:pPr>
-            <w:r>
-              <w:rPr>
-                <w:sz w:val="18"/>
-                <w:szCs w:val="18"/>
-              </w:rPr>
-              <w:sym w:font="Wingdings" w:char="F070"/>
-            </w:r>
-            <w:r>
-              <w:rPr>
-                <w:sz w:val="18"/>
-                <w:szCs w:val="18"/>
-              </w:rPr>
-              <w:t xml:space="preserve">News Media</w:t>
-            </w:r>
-          </w:p>
-          <w:p>
-            <w:pPr>
-              <w:spacing w:after="0" w:line="240" w:lineRule="auto"/>
-              <w:rPr>
-                <w:sz w:val="18"/>
-                <w:szCs w:val="18"/>
-              </w:rPr>
-            </w:pPr>
-            <w:r>
-              <w:rPr>
-                <w:sz w:val="18"/>
-                <w:szCs w:val="18"/>
-              </w:rPr>
-              <w:sym w:font="Wingdings" w:char="F070"/>
-            </w:r>
-            <w:r>
-              <w:rPr>
-                <w:sz w:val="18"/>
-                <w:szCs w:val="18"/>
-              </w:rPr>
-              <w:t xml:space="preserve">Other Operators</w:t>
-            </w:r>
-          </w:p>
-          <w:p>
-            <w:pPr>
-              <w:spacing w:after="0" w:line="240" w:lineRule="auto"/>
-              <w:rPr>
-                <w:sz w:val="18"/>
-                <w:szCs w:val="18"/>
-              </w:rPr>
-            </w:pPr>
-            <w:r>
-              <w:rPr>
-                <w:sz w:val="18"/>
-                <w:szCs w:val="18"/>
-              </w:rPr>
-              <w:sym w:font="Wingdings" w:char="F070"/>
-            </w:r>
-            <w:r>
-              <w:rPr>
-                <w:sz w:val="18"/>
-                <w:szCs w:val="18"/>
-              </w:rPr>
-              <w:t xml:space="preserve">Online Portals/Databases</w:t>
-            </w:r>
-          </w:p>
-          <w:p>
-            <w:pPr>
-              <w:spacing w:after="0" w:line="240" w:lineRule="auto"/>
-              <w:rPr>
-                <w:sz w:val="18"/>
-                <w:szCs w:val="18"/>
-              </w:rPr>
-            </w:pPr>
-            <w:r>
-              <w:rPr>
-                <w:sz w:val="18"/>
-                <w:szCs w:val="18"/>
-              </w:rPr>
-              <w:sym w:font="Wingdings" w:char="F070"/>
-            </w:r>
-            <w:r>
-              <w:rPr>
-                <w:sz w:val="18"/>
-                <w:szCs w:val="18"/>
-              </w:rPr>
-              <w:t xml:space="preserve">Other source</w:t>
-            </w:r>
-          </w:p>
-        </w:tc>
-        <w:tc>
-          <w:tcPr>
-            <w:tcW w:w="1120" w:type="dxa"/>
-          </w:tcPr>
-          <w:p>
-            <w:pPr>
-              <w:spacing w:after="0" w:line="240" w:lineRule="auto"/>
-              <w:jc w:val="center"/>
-              <w:rPr>
-                <w:b/>
-                <w:bCs/>
-                <w:sz w:val="18"/>
-                <w:szCs w:val="18"/>
-              </w:rPr>
-            </w:pPr>
-            <w:r>
-              <w:rPr>
-                <w:b/>
-                <w:bCs/>
-                <w:sz w:val="18"/>
-                <w:szCs w:val="18"/>
-              </w:rPr>
-              <w:t xml:space="preserve">N/A</w:t>
-            </w:r>
-          </w:p>
-        </w:tc>
-        <w:tc>
-          <w:tcPr>
-            <w:tcW w:w="1691" w:type="dxa"/>
-          </w:tcPr>
-          <w:p>
-            <w:pPr>
-              <w:spacing w:after="0" w:line="240" w:lineRule="auto"/>
-              <w:jc w:val="center"/>
-              <w:rPr>
-                <w:sz w:val="18"/>
-                <w:szCs w:val="18"/>
-              </w:rPr>
-            </w:pPr>
-            <w:r>
-              <w:rPr>
-                <w:sz w:val="18"/>
-                <w:szCs w:val="18"/>
-              </w:rPr>
-              <w:t xml:space="preserve">N/A</w:t>
-            </w:r>
-          </w:p>
-        </w:tc>
-        <w:tc>
-          <w:tcPr>
-            <w:tcW w:w="2270" w:type="dxa"/>
-          </w:tcPr>
-          <w:p>
-            <w:pPr>
-              <w:spacing w:after="0" w:line="240" w:lineRule="auto"/>
-              <w:jc w:val="center"/>
-              <w:rPr>
-                <w:sz w:val="18"/>
-                <w:szCs w:val="18"/>
-              </w:rPr>
-            </w:pPr>
-            <w:r>
-              <w:rPr>
-                <w:sz w:val="18"/>
-                <w:szCs w:val="18"/>
-              </w:rPr>
-              <w:t xml:space="preserve">N/A</w:t>
-            </w:r>
-          </w:p>
-        </w:tc>
-      </w:tr>
-      <w:tr>
-        <w:tc>
-          <w:tcPr>
-            <w:tcW w:w="1364" w:type="dxa"/>
-          </w:tcPr>
-          <w:p>
-            <w:pPr>
-              <w:spacing w:after="0" w:line="240" w:lineRule="auto"/>
-              <w:rPr>
-                <w:sz w:val="18"/>
-                <w:szCs w:val="18"/>
-              </w:rPr>
-            </w:pPr>
-            <w:r>
-              <w:rPr>
-                <w:color w:val="000000"/>
-                <w:sz w:val="18"/>
-                <w:szCs w:val="18"/>
-              </w:rPr>
-              <w:t>Directory Enquiry Obligations</w:t>
-            </w:r>
-          </w:p>
-        </w:tc>
-        <w:tc>
-          <w:tcPr>
-            <w:tcW w:w="2132" w:type="dxa"/>
-          </w:tcPr>
-          <w:p>
-            <w:pPr>
-              <w:spacing w:after="0" w:line="240" w:lineRule="auto"/>
-              <w:rPr>
-                <w:sz w:val="18"/>
-                <w:szCs w:val="18"/>
-              </w:rPr>
-            </w:pPr>
-            <w:r>
-              <w:rPr>
-                <w:sz w:val="18"/>
-                <w:szCs w:val="18"/>
-              </w:rPr>
-              <w:sym w:font="Wingdings" w:char="F070"/>
-            </w:r>
-            <w:r>
-              <w:rPr>
-                <w:sz w:val="18"/>
-                <w:szCs w:val="18"/>
-              </w:rPr>
-              <w:t xml:space="preserve">Consultation Paper</w:t>
-            </w:r>
-          </w:p>
-          <w:p>
-            <w:pPr>
-              <w:spacing w:after="0" w:line="240" w:lineRule="auto"/>
-              <w:rPr>
-                <w:sz w:val="18"/>
-                <w:szCs w:val="18"/>
-              </w:rPr>
-            </w:pPr>
-            <w:r>
-              <w:rPr>
-                <w:sz w:val="18"/>
-                <w:szCs w:val="18"/>
-              </w:rPr>
-              <w:sym w:font="Wingdings" w:char="F070"/>
-            </w:r>
-            <w:r>
-              <w:rPr>
-                <w:sz w:val="18"/>
-                <w:szCs w:val="18"/>
-              </w:rPr>
-              <w:t xml:space="preserve">Initial Talks</w:t>
-            </w:r>
-          </w:p>
-          <w:p>
-            <w:pPr>
-              <w:spacing w:after="0" w:line="240" w:lineRule="auto"/>
-              <w:rPr>
-                <w:sz w:val="18"/>
-                <w:szCs w:val="18"/>
-              </w:rPr>
-            </w:pPr>
-            <w:r>
-              <w:rPr>
-                <w:sz w:val="18"/>
-                <w:szCs w:val="18"/>
-              </w:rPr>
-              <w:sym w:font="Wingdings" w:char="F070"/>
-            </w:r>
-            <w:r>
-              <w:rPr>
-                <w:sz w:val="18"/>
-                <w:szCs w:val="18"/>
-              </w:rPr>
-              <w:t xml:space="preserve">Policy Document</w:t>
-            </w:r>
-          </w:p>
-          <w:p>
-            <w:pPr>
-              <w:spacing w:after="0" w:line="240" w:lineRule="auto"/>
-              <w:rPr>
-                <w:sz w:val="18"/>
-                <w:szCs w:val="18"/>
-              </w:rPr>
-            </w:pPr>
-            <w:r>
-              <w:rPr>
-                <w:sz w:val="18"/>
-                <w:szCs w:val="18"/>
-              </w:rPr>
-              <w:sym w:font="Wingdings" w:char="F070"/>
-            </w:r>
-            <w:r>
-              <w:rPr>
-                <w:sz w:val="18"/>
-                <w:szCs w:val="18"/>
-              </w:rPr>
-              <w:t xml:space="preserve">Regulation/Directives</w:t>
-            </w:r>
-          </w:p>
-          <w:p>
-            <w:pPr>
-              <w:spacing w:after="0" w:line="240" w:lineRule="auto"/>
-              <w:rPr>
-                <w:sz w:val="18"/>
-                <w:szCs w:val="18"/>
-              </w:rPr>
-            </w:pPr>
-            <w:r>
-              <w:rPr>
-                <w:sz w:val="18"/>
-                <w:szCs w:val="18"/>
-              </w:rPr>
-              <w:sym w:font="Wingdings" w:char="F070"/>
-            </w:r>
-            <w:r>
-              <w:rPr>
-                <w:sz w:val="18"/>
-                <w:szCs w:val="18"/>
-              </w:rPr>
-              <w:t xml:space="preserve">Recommendation of Regulator (NRA)</w:t>
-            </w:r>
-          </w:p>
-          <w:p>
-            <w:pPr>
-              <w:spacing w:after="0" w:line="240" w:lineRule="auto"/>
-              <w:rPr>
-                <w:sz w:val="18"/>
-                <w:szCs w:val="18"/>
-              </w:rPr>
-            </w:pPr>
-            <w:r>
-              <w:rPr>
-                <w:sz w:val="18"/>
-                <w:szCs w:val="18"/>
-              </w:rPr>
-              <w:sym w:font="Wingdings" w:char="F070"/>
-            </w:r>
-            <w:r>
-              <w:rPr>
-                <w:sz w:val="18"/>
-                <w:szCs w:val="18"/>
-              </w:rPr>
-              <w:t xml:space="preserve">Court Orders</w:t>
-            </w:r>
-          </w:p>
-          <w:p>
-            <w:pPr>
-              <w:spacing w:after="0" w:line="240" w:lineRule="auto"/>
-              <w:rPr>
-                <w:sz w:val="18"/>
-                <w:szCs w:val="18"/>
-              </w:rPr>
-            </w:pPr>
-            <w:r>
-              <w:rPr>
-                <w:sz w:val="18"/>
-                <w:szCs w:val="18"/>
-              </w:rPr>
-              <w:sym w:font="Wingdings" w:char="F070"/>
-            </w:r>
-            <w:r>
-              <w:rPr>
-                <w:sz w:val="18"/>
-                <w:szCs w:val="18"/>
-              </w:rPr>
-              <w:t xml:space="preserve">MOU between Operator</w:t>
-            </w:r>
-          </w:p>
-          <w:p>
-            <w:pPr>
-              <w:spacing w:after="0" w:line="240" w:lineRule="auto"/>
-              <w:rPr>
-                <w:sz w:val="18"/>
-                <w:szCs w:val="18"/>
-              </w:rPr>
-            </w:pPr>
-            <w:r>
-              <w:rPr>
-                <w:sz w:val="18"/>
-                <w:szCs w:val="18"/>
-              </w:rPr>
-              <w:sym w:font="Wingdings" w:char="F070"/>
-            </w:r>
-            <w:r>
-              <w:rPr>
-                <w:sz w:val="18"/>
-                <w:szCs w:val="18"/>
-              </w:rPr>
-              <w:t xml:space="preserve">NRA Compliance Notice</w:t>
-            </w:r>
-          </w:p>
-          <w:p>
-            <w:pPr>
-              <w:spacing w:after="0" w:line="240" w:lineRule="auto"/>
-              <w:rPr>
-                <w:sz w:val="18"/>
-                <w:szCs w:val="18"/>
-              </w:rPr>
-            </w:pPr>
-            <w:r>
-              <w:rPr>
-                <w:sz w:val="18"/>
-                <w:szCs w:val="18"/>
-              </w:rPr>
-              <w:sym w:font="Wingdings" w:char="F070"/>
-            </w:r>
-            <w:r>
-              <w:rPr>
-                <w:sz w:val="18"/>
-                <w:szCs w:val="18"/>
-              </w:rPr>
-              <w:t xml:space="preserve">Licensing Amendment</w:t>
-            </w:r>
-          </w:p>
-          <w:p>
-            <w:pPr>
-              <w:spacing w:after="0" w:line="240" w:lineRule="auto"/>
-              <w:rPr>
-                <w:sz w:val="18"/>
-                <w:szCs w:val="18"/>
-              </w:rPr>
-            </w:pPr>
-            <w:r>
-              <w:rPr>
-                <w:sz w:val="18"/>
-                <w:szCs w:val="18"/>
-              </w:rPr>
-              <w:sym w:font="Wingdings" w:char="F070"/>
-            </w:r>
-            <w:r>
-              <w:rPr>
-                <w:sz w:val="18"/>
-                <w:szCs w:val="18"/>
-              </w:rPr>
-              <w:t xml:space="preserve">Others</w:t>
-            </w:r>
-          </w:p>
-        </w:tc>
-        <w:tc>
-          <w:tcPr>
-            <w:tcW w:w="3222" w:type="dxa"/>
-          </w:tcPr>
-          <w:p>
-            <w:pPr>
-              <w:spacing w:after="0" w:line="240" w:lineRule="auto"/>
-              <w:jc w:val="center"/>
-              <w:rPr>
-                <w:b/>
-                <w:bCs/>
-                <w:sz w:val="18"/>
-                <w:szCs w:val="18"/>
-              </w:rPr>
-            </w:pPr>
-            <w:r>
-              <w:rPr>
-                <w:b/>
-                <w:bCs/>
-                <w:sz w:val="18"/>
-                <w:szCs w:val="18"/>
-              </w:rPr>
-              <w:t xml:space="preserve">“NO UPDATED INFORMATION IS AVAILABLE, INFORMATION IS SAME AS EARLIER”</w:t>
-            </w:r>
-          </w:p>
-        </w:tc>
-        <w:tc>
-          <w:tcPr>
-            <w:tcW w:w="2349" w:type="dxa"/>
-          </w:tcPr>
-          <w:p>
-            <w:pPr>
-              <w:spacing w:after="0" w:line="240" w:lineRule="auto"/>
-              <w:rPr>
-                <w:sz w:val="18"/>
-                <w:szCs w:val="18"/>
-              </w:rPr>
-            </w:pPr>
-            <w:r>
-              <w:rPr>
-                <w:sz w:val="18"/>
-                <w:szCs w:val="18"/>
-              </w:rPr>
-              <w:sym w:font="Wingdings" w:char="F070"/>
-            </w:r>
-            <w:r>
-              <w:rPr>
-                <w:sz w:val="18"/>
-                <w:szCs w:val="18"/>
-              </w:rPr>
-              <w:t xml:space="preserve">Website</w:t>
-            </w:r>
-          </w:p>
-          <w:p>
-            <w:pPr>
-              <w:spacing w:after="0" w:line="240" w:lineRule="auto"/>
-              <w:rPr>
-                <w:sz w:val="18"/>
-                <w:szCs w:val="18"/>
-              </w:rPr>
-            </w:pPr>
-            <w:r>
-              <w:rPr>
-                <w:sz w:val="18"/>
-                <w:szCs w:val="18"/>
-              </w:rPr>
-              <w:sym w:font="Wingdings" w:char="F070"/>
-            </w:r>
-            <w:r>
-              <w:rPr>
-                <w:sz w:val="18"/>
-                <w:szCs w:val="18"/>
-              </w:rPr>
-              <w:t xml:space="preserve">Regulator/ITU</w:t>
-            </w:r>
-          </w:p>
-          <w:p>
-            <w:pPr>
-              <w:spacing w:after="0" w:line="240" w:lineRule="auto"/>
-              <w:rPr>
-                <w:sz w:val="18"/>
-                <w:szCs w:val="18"/>
-              </w:rPr>
-            </w:pPr>
-            <w:r>
-              <w:rPr>
-                <w:sz w:val="18"/>
-                <w:szCs w:val="18"/>
-              </w:rPr>
-              <w:sym w:font="Wingdings" w:char="F070"/>
-            </w:r>
-            <w:r>
-              <w:rPr>
-                <w:sz w:val="18"/>
-                <w:szCs w:val="18"/>
-              </w:rPr>
-              <w:t xml:space="preserve">Industry Publications</w:t>
-            </w:r>
-          </w:p>
-          <w:p>
-            <w:pPr>
-              <w:spacing w:after="0" w:line="240" w:lineRule="auto"/>
-              <w:rPr>
-                <w:sz w:val="18"/>
-                <w:szCs w:val="18"/>
-              </w:rPr>
-            </w:pPr>
-            <w:r>
-              <w:rPr>
-                <w:sz w:val="18"/>
-                <w:szCs w:val="18"/>
-              </w:rPr>
-              <w:sym w:font="Wingdings" w:char="F070"/>
-            </w:r>
-            <w:r>
-              <w:rPr>
-                <w:sz w:val="18"/>
-                <w:szCs w:val="18"/>
-              </w:rPr>
-              <w:t xml:space="preserve">News Media</w:t>
-            </w:r>
-          </w:p>
-          <w:p>
-            <w:pPr>
-              <w:spacing w:after="0" w:line="240" w:lineRule="auto"/>
-              <w:rPr>
-                <w:sz w:val="18"/>
-                <w:szCs w:val="18"/>
-              </w:rPr>
-            </w:pPr>
-            <w:r>
-              <w:rPr>
-                <w:sz w:val="18"/>
-                <w:szCs w:val="18"/>
-              </w:rPr>
-              <w:sym w:font="Wingdings" w:char="F070"/>
-            </w:r>
-            <w:r>
-              <w:rPr>
-                <w:sz w:val="18"/>
-                <w:szCs w:val="18"/>
-              </w:rPr>
-              <w:t xml:space="preserve">Other Operators</w:t>
-            </w:r>
-          </w:p>
-          <w:p>
-            <w:pPr>
-              <w:spacing w:after="0" w:line="240" w:lineRule="auto"/>
-              <w:rPr>
-                <w:sz w:val="18"/>
-                <w:szCs w:val="18"/>
-              </w:rPr>
-            </w:pPr>
-            <w:r>
-              <w:rPr>
-                <w:sz w:val="18"/>
-                <w:szCs w:val="18"/>
-              </w:rPr>
-              <w:sym w:font="Wingdings" w:char="F070"/>
-            </w:r>
-            <w:r>
-              <w:rPr>
-                <w:sz w:val="18"/>
-                <w:szCs w:val="18"/>
-              </w:rPr>
-              <w:t xml:space="preserve">Online Portals/Databases</w:t>
-            </w:r>
-          </w:p>
-          <w:p>
-            <w:pPr>
-              <w:spacing w:after="0" w:line="240" w:lineRule="auto"/>
-              <w:rPr>
-                <w:sz w:val="18"/>
-                <w:szCs w:val="18"/>
-              </w:rPr>
-            </w:pPr>
-            <w:r>
-              <w:rPr>
-                <w:sz w:val="18"/>
-                <w:szCs w:val="18"/>
-              </w:rPr>
-              <w:sym w:font="Wingdings" w:char="F070"/>
-            </w:r>
-            <w:r>
-              <w:rPr>
-                <w:sz w:val="18"/>
-                <w:szCs w:val="18"/>
-              </w:rPr>
-              <w:t xml:space="preserve">Other source</w:t>
-            </w:r>
-          </w:p>
-        </w:tc>
-        <w:tc>
-          <w:tcPr>
-            <w:tcW w:w="1120" w:type="dxa"/>
-          </w:tcPr>
-          <w:p>
-            <w:pPr>
-              <w:spacing w:after="0" w:line="240" w:lineRule="auto"/>
-              <w:jc w:val="center"/>
-              <w:rPr>
-                <w:b/>
-                <w:bCs/>
-                <w:sz w:val="18"/>
-                <w:szCs w:val="18"/>
-              </w:rPr>
-            </w:pPr>
-            <w:r>
-              <w:rPr>
-                <w:b/>
-                <w:bCs/>
-                <w:sz w:val="18"/>
-                <w:szCs w:val="18"/>
-              </w:rPr>
-              <w:t xml:space="preserve">N/A</w:t>
-            </w:r>
-          </w:p>
-        </w:tc>
-        <w:tc>
-          <w:tcPr>
-            <w:tcW w:w="1691" w:type="dxa"/>
-          </w:tcPr>
-          <w:p>
-            <w:pPr>
-              <w:spacing w:after="0" w:line="240" w:lineRule="auto"/>
-              <w:jc w:val="center"/>
-              <w:rPr>
-                <w:sz w:val="18"/>
-                <w:szCs w:val="18"/>
-              </w:rPr>
-            </w:pPr>
-            <w:r>
-              <w:rPr>
-                <w:sz w:val="18"/>
-                <w:szCs w:val="18"/>
-              </w:rPr>
-              <w:t xml:space="preserve">N/A</w:t>
-            </w:r>
-          </w:p>
-        </w:tc>
-        <w:tc>
-          <w:tcPr>
-            <w:tcW w:w="2270" w:type="dxa"/>
-          </w:tcPr>
-          <w:p>
-            <w:pPr>
-              <w:spacing w:after="0" w:line="240" w:lineRule="auto"/>
-              <w:jc w:val="center"/>
-              <w:rPr>
-                <w:sz w:val="18"/>
-                <w:szCs w:val="18"/>
-              </w:rPr>
-            </w:pPr>
-            <w:r>
-              <w:rPr>
-                <w:sz w:val="18"/>
-                <w:szCs w:val="18"/>
-              </w:rPr>
-              <w:t xml:space="preserve">N/A</w:t>
-            </w:r>
-          </w:p>
-        </w:tc>
-      </w:tr>
-      <w:tr>
-        <w:tc>
-          <w:tcPr>
-            <w:tcW w:w="1364" w:type="dxa"/>
-          </w:tcPr>
-          <w:p>
-            <w:pPr>
-              <w:spacing w:after="0" w:line="240" w:lineRule="auto"/>
-              <w:rPr>
-                <w:sz w:val="18"/>
-                <w:szCs w:val="18"/>
-              </w:rPr>
-            </w:pPr>
-            <w:r>
-              <w:rPr>
-                <w:color w:val="000000"/>
-                <w:sz w:val="18"/>
-                <w:szCs w:val="18"/>
-              </w:rPr>
-              <w:t>QoS KPI Obligations</w:t>
-            </w:r>
-          </w:p>
-        </w:tc>
-        <w:tc>
-          <w:tcPr>
-            <w:tcW w:w="2132" w:type="dxa"/>
-          </w:tcPr>
-          <w:p>
-            <w:pPr>
-              <w:spacing w:after="0" w:line="240" w:lineRule="auto"/>
-              <w:rPr>
-                <w:sz w:val="18"/>
-                <w:szCs w:val="18"/>
-              </w:rPr>
-            </w:pPr>
-            <w:r>
-              <w:rPr>
-                <w:sz w:val="18"/>
-                <w:szCs w:val="18"/>
-              </w:rPr>
-              <w:sym w:font="Wingdings" w:char="F070"/>
-            </w:r>
-            <w:r>
-              <w:rPr>
-                <w:sz w:val="18"/>
-                <w:szCs w:val="18"/>
-              </w:rPr>
-              <w:t xml:space="preserve">Consultation Paper</w:t>
-            </w:r>
-          </w:p>
-          <w:p>
-            <w:pPr>
-              <w:spacing w:after="0" w:line="240" w:lineRule="auto"/>
-              <w:rPr>
-                <w:sz w:val="18"/>
-                <w:szCs w:val="18"/>
-              </w:rPr>
-            </w:pPr>
-            <w:r>
-              <w:rPr>
-                <w:sz w:val="18"/>
-                <w:szCs w:val="18"/>
-              </w:rPr>
-              <w:sym w:font="Wingdings" w:char="F070"/>
-            </w:r>
-            <w:r>
-              <w:rPr>
-                <w:sz w:val="18"/>
-                <w:szCs w:val="18"/>
-              </w:rPr>
-              <w:t xml:space="preserve">Initial Talks</w:t>
-            </w:r>
-          </w:p>
-          <w:p>
-            <w:pPr>
-              <w:spacing w:after="0" w:line="240" w:lineRule="auto"/>
-              <w:rPr>
-                <w:sz w:val="18"/>
-                <w:szCs w:val="18"/>
-              </w:rPr>
-            </w:pPr>
-            <w:r>
-              <w:rPr>
-                <w:sz w:val="18"/>
-                <w:szCs w:val="18"/>
-              </w:rPr>
-              <w:sym w:font="Wingdings" w:char="F070"/>
-            </w:r>
-            <w:r>
-              <w:rPr>
-                <w:sz w:val="18"/>
-                <w:szCs w:val="18"/>
-              </w:rPr>
-              <w:t xml:space="preserve">Policy Document</w:t>
-            </w:r>
-          </w:p>
-          <w:p>
-            <w:pPr>
-              <w:spacing w:after="0" w:line="240" w:lineRule="auto"/>
-              <w:rPr>
-                <w:sz w:val="18"/>
-                <w:szCs w:val="18"/>
-              </w:rPr>
-            </w:pPr>
-            <w:r>
-              <w:rPr>
-                <w:b/>
-                <w:bCs/>
-                <w:sz w:val="18"/>
-                <w:szCs w:val="18"/>
-              </w:rPr>
-              <w:sym w:font="Wingdings" w:char="F0FE"/>
-            </w:r>
-            <w:r>
-              <w:rPr>
-                <w:b/>
-                <w:bCs/>
-                <w:sz w:val="18"/>
-                <w:szCs w:val="18"/>
-              </w:rPr>
-              <w:t xml:space="preserve">Regulation/Directives</w:t>
-            </w:r>
-          </w:p>
-          <w:p>
-            <w:pPr>
-              <w:spacing w:after="0" w:line="240" w:lineRule="auto"/>
-              <w:rPr>
-                <w:sz w:val="18"/>
-                <w:szCs w:val="18"/>
-              </w:rPr>
-            </w:pPr>
-            <w:r>
-              <w:rPr>
-                <w:sz w:val="18"/>
-                <w:szCs w:val="18"/>
-              </w:rPr>
-              <w:sym w:font="Wingdings" w:char="F070"/>
-            </w:r>
-            <w:r>
-              <w:rPr>
-                <w:sz w:val="18"/>
-                <w:szCs w:val="18"/>
-              </w:rPr>
-              <w:t xml:space="preserve">Recommendation of Regulator (NRA)</w:t>
-            </w:r>
-          </w:p>
-          <w:p>
-            <w:pPr>
-              <w:spacing w:after="0" w:line="240" w:lineRule="auto"/>
-              <w:rPr>
-                <w:sz w:val="18"/>
-                <w:szCs w:val="18"/>
-              </w:rPr>
-            </w:pPr>
-            <w:r>
-              <w:rPr>
-                <w:sz w:val="18"/>
-                <w:szCs w:val="18"/>
-              </w:rPr>
-              <w:sym w:font="Wingdings" w:char="F070"/>
-            </w:r>
-            <w:r>
-              <w:rPr>
-                <w:sz w:val="18"/>
-                <w:szCs w:val="18"/>
-              </w:rPr>
-              <w:t xml:space="preserve">Court Orders</w:t>
-            </w:r>
-          </w:p>
-          <w:p>
-            <w:pPr>
-              <w:spacing w:after="0" w:line="240" w:lineRule="auto"/>
-              <w:rPr>
-                <w:sz w:val="18"/>
-                <w:szCs w:val="18"/>
-              </w:rPr>
-            </w:pPr>
-            <w:r>
-              <w:rPr>
-                <w:sz w:val="18"/>
-                <w:szCs w:val="18"/>
-              </w:rPr>
-              <w:sym w:font="Wingdings" w:char="F070"/>
-            </w:r>
-            <w:r>
-              <w:rPr>
-                <w:sz w:val="18"/>
-                <w:szCs w:val="18"/>
-              </w:rPr>
-              <w:t xml:space="preserve">MOU between Operator</w:t>
-            </w:r>
-          </w:p>
-          <w:p>
-            <w:pPr>
-              <w:spacing w:after="0" w:line="240" w:lineRule="auto"/>
-              <w:rPr>
-                <w:sz w:val="18"/>
-                <w:szCs w:val="18"/>
-              </w:rPr>
-            </w:pPr>
-            <w:r>
-              <w:rPr>
-                <w:sz w:val="18"/>
-                <w:szCs w:val="18"/>
-              </w:rPr>
-              <w:sym w:font="Wingdings" w:char="F070"/>
-            </w:r>
-            <w:r>
-              <w:rPr>
-                <w:sz w:val="18"/>
-                <w:szCs w:val="18"/>
-              </w:rPr>
-              <w:t xml:space="preserve">NRA Compliance Notice</w:t>
-            </w:r>
-          </w:p>
-          <w:p>
-            <w:pPr>
-              <w:spacing w:after="0" w:line="240" w:lineRule="auto"/>
-              <w:rPr>
-                <w:sz w:val="18"/>
-                <w:szCs w:val="18"/>
-              </w:rPr>
-            </w:pPr>
-            <w:r>
-              <w:rPr>
-                <w:sz w:val="18"/>
-                <w:szCs w:val="18"/>
-              </w:rPr>
-              <w:sym w:font="Wingdings" w:char="F070"/>
-            </w:r>
-            <w:r>
-              <w:rPr>
-                <w:sz w:val="18"/>
-                <w:szCs w:val="18"/>
-              </w:rPr>
-              <w:t xml:space="preserve">Licensing Amendment</w:t>
-            </w:r>
-          </w:p>
-          <w:p>
-            <w:pPr>
-              <w:spacing w:after="0" w:line="240" w:lineRule="auto"/>
-              <w:rPr>
-                <w:sz w:val="18"/>
-                <w:szCs w:val="18"/>
-              </w:rPr>
-            </w:pPr>
-            <w:r>
-              <w:rPr>
-                <w:b/>
-                <w:bCs/>
-                <w:sz w:val="18"/>
-                <w:szCs w:val="18"/>
-              </w:rPr>
-              <w:sym w:font="Wingdings" w:char="F0FE"/>
-            </w:r>
-            <w:r>
-              <w:rPr>
-                <w:b/>
-                <w:bCs/>
-                <w:sz w:val="18"/>
-                <w:szCs w:val="18"/>
-              </w:rPr>
-              <w:t xml:space="preserve">Others</w:t>
-            </w:r>
-          </w:p>
-        </w:tc>
-        <w:tc>
-          <w:tcPr>
-            <w:tcW w:w="3222" w:type="dxa"/>
-          </w:tcPr>
-          <w:p>
-            <w:pPr>
-              <w:pStyle w:val="ListParagraph"/>
-              <w:numPr>
-                <w:ilvl w:val="0"/>
-                <w:numId w:val="4"/>
-              </w:numPr>
-              <w:spacing w:after="0" w:line="240" w:lineRule="auto"/>
-              <w:ind w:left="216" w:hanging="216"/>
-              <w:rPr>
-                <w:b/>
-                <w:bCs/>
-                <w:sz w:val="18"/>
-                <w:szCs w:val="18"/>
-              </w:rPr>
-            </w:pPr>
-            <w:r>
-              <w:rPr>
-                <w:b/>
-                <w:bCs/>
-                <w:sz w:val="18"/>
-                <w:szCs w:val="18"/>
-              </w:rPr>
-              <w:t xml:space="preserve">On 25 September 2026 TRAI launched the Digital Connectivity Rating (DCR) platform and a field-testing mobile app. They put into operation its framework for rating residential, commercial and government properties on in-building digital connectivity.</w:t>
-            </w:r>
-          </w:p>
-          <w:p>
-            <w:pPr>
-              <w:pStyle w:val="ListParagraph"/>
-              <w:numPr>
-                <w:ilvl w:val="0"/>
-                <w:numId w:val="4"/>
-              </w:numPr>
-              <w:spacing w:after="0" w:line="240" w:lineRule="auto"/>
-              <w:ind w:left="216" w:hanging="216"/>
-              <w:rPr>
-                <w:b/>
-                <w:bCs/>
-                <w:sz w:val="18"/>
-                <w:szCs w:val="18"/>
-              </w:rPr>
-            </w:pPr>
-            <w:r>
-              <w:rPr>
-                <w:b/>
-                <w:bCs/>
-                <w:sz w:val="18"/>
-                <w:szCs w:val="18"/>
-              </w:rPr>
-              <w:t xml:space="preserve">The platform brings together property managers, registered Digital Connectivity Rating Agencies (DCRAs) and consumers. Ratings cover fibre readiness, mobile network (4G/5G) availability, in-building solutions and Wi-Fi. Certificates are digitally signed and can be verified by QR code.</w:t>
-            </w:r>
-          </w:p>
-          <w:p>
-            <w:pPr>
-              <w:pStyle w:val="ListParagraph"/>
-              <w:numPr>
-                <w:ilvl w:val="0"/>
-                <w:numId w:val="4"/>
-              </w:numPr>
-              <w:spacing w:after="0" w:line="240" w:lineRule="auto"/>
-              <w:ind w:left="216" w:hanging="216"/>
-              <w:rPr>
-                <w:b/>
-                <w:bCs/>
-                <w:sz w:val="18"/>
-                <w:szCs w:val="18"/>
-              </w:rPr>
-            </w:pPr>
-            <w:r>
-              <w:rPr>
-                <w:b/>
-                <w:bCs/>
-                <w:sz w:val="18"/>
-                <w:szCs w:val="18"/>
-              </w:rPr>
-              <w:t xml:space="preserve">About 70–80% of mobile usage takes place indoors, so the framework makes indoor coverage and quality of service a measurable attribute. This adds to the existing TRAI QoS KPIs (call drop rate, CSSR, throughput) measured through Independent Drive Tests.</w:t>
+                <w:b/>
+                <w:bCs/>
+                <w:sz w:val="18"/>
+                <w:szCs w:val="18"/>
+              </w:rPr>
+            </w:pPr>
+            <w:r>
+              <w:rPr>
+                <w:b/>
+                <w:bCs/>
+                <w:sz w:val="18"/>
+                <w:szCs w:val="18"/>
+              </w:rPr>
+              <w:t xml:space="preserve">About 70–80% of mobile usage takes place indoors, so the framework makes indoor coverage and quality of service a measurable attribute of buildings.</w:t>
             </w:r>
           </w:p>
         </w:tc>
@@ -4974,27 +4857,6 @@
               </w:r>
             </w:hyperlink>
           </w:p>
-          <w:p>
-            <w:pPr>
-              <w:spacing w:after="0" w:line="240" w:lineRule="auto"/>
-              <w:rPr>
-                <w:sz w:val="18"/>
-                <w:szCs w:val="18"/>
-              </w:rPr>
-            </w:pPr>
-            <w:hyperlink r:id="rId108" w:history="1">
-              <w:r>
-                <w:rPr>
-                  <w:rStyle w:val="Hyperlink"/>
-                  <w:color w:val="0563C1"/>
-                  <w:u w:val="single"/>
-                  <w:sz w:val="18"/>
-                  <w:szCs w:val="18"/>
-                </w:rPr>
-                <w:t xml:space="preserve">https://www.trai.gov.in/release-publication/qos-reports/idt-reports</w:t>
-              </w:r>
-            </w:hyperlink>
-          </w:p>
         </w:tc>
       </w:tr>
       <w:tr>
@@ -6602,7 +6464,7 @@
                 <w:szCs w:val="18"/>
               </w:rPr>
             </w:pPr>
-            <w:hyperlink r:id="rId109" w:history="1">
+            <w:hyperlink r:id="rId108" w:history="1">
               <w:r>
                 <w:rPr>
                   <w:rStyle w:val="Hyperlink"/>
@@ -6623,7 +6485,7 @@
                 <w:szCs w:val="18"/>
               </w:rPr>
             </w:pPr>
-            <w:hyperlink r:id="rId110" w:history="1">
+            <w:hyperlink r:id="rId109" w:history="1">
               <w:r>
                 <w:rPr>
                   <w:rStyle w:val="Hyperlink"/>
@@ -7710,7 +7572,7 @@
                 <w:szCs w:val="18"/>
               </w:rPr>
             </w:pPr>
-            <w:hyperlink r:id="rId111" w:history="1">
+            <w:hyperlink r:id="rId110" w:history="1">
               <w:r>
                 <w:rPr>
                   <w:rStyle w:val="Hyperlink"/>
@@ -8308,7 +8170,7 @@
                 <w:szCs w:val="18"/>
               </w:rPr>
             </w:pPr>
-            <w:hyperlink r:id="rId112" w:history="1">
+            <w:hyperlink r:id="rId111" w:history="1">
               <w:r>
                 <w:rPr>
                   <w:rStyle w:val="Hyperlink"/>
@@ -8329,7 +8191,7 @@
                 <w:szCs w:val="18"/>
               </w:rPr>
             </w:pPr>
-            <w:hyperlink r:id="rId113" w:history="1">
+            <w:hyperlink r:id="rId112" w:history="1">
               <w:r>
                 <w:rPr>
                   <w:rStyle w:val="Hyperlink"/>
@@ -11523,7 +11385,7 @@
                 <w:szCs w:val="18"/>
               </w:rPr>
             </w:pPr>
-            <w:hyperlink r:id="rId114" w:history="1">
+            <w:hyperlink r:id="rId113" w:history="1">
               <w:r>
                 <w:rPr>
                   <w:rStyle w:val="Hyperlink"/>
@@ -11544,7 +11406,7 @@
                 <w:szCs w:val="18"/>
               </w:rPr>
             </w:pPr>
-            <w:hyperlink r:id="rId115" w:history="1">
+            <w:hyperlink r:id="rId114" w:history="1">
               <w:r>
                 <w:rPr>
                   <w:rStyle w:val="Hyperlink"/>
@@ -11565,7 +11427,7 @@
                 <w:szCs w:val="18"/>
               </w:rPr>
             </w:pPr>
-            <w:hyperlink r:id="rId116" w:history="1">
+            <w:hyperlink r:id="rId115" w:history="1">
               <w:r>
                 <w:rPr>
                   <w:rStyle w:val="Hyperlink"/>
@@ -13209,7 +13071,7 @@
                 <w:szCs w:val="18"/>
               </w:rPr>
             </w:pPr>
-            <w:hyperlink r:id="rId117" w:history="1">
+            <w:hyperlink r:id="rId116" w:history="1">
               <w:r>
                 <w:rPr>
                   <w:rStyle w:val="Hyperlink"/>
@@ -13230,7 +13092,7 @@
                 <w:szCs w:val="18"/>
               </w:rPr>
             </w:pPr>
-            <w:hyperlink r:id="rId118" w:history="1">
+            <w:hyperlink r:id="rId117" w:history="1">
               <w:r>
                 <w:rPr>
                   <w:rStyle w:val="Hyperlink"/>

</xml_diff>

<commit_message>
Add Hong Kong VDR Sept 2026; centre header values in India report
Co-Authored-By: Claude Opus 5.5 <noreply@anthropic.com>
Claude-Session: https://claude.ai/code/session_01Kn2WARNo7K7k12QYTPEKnR
</commit_message>
<xml_diff>
--- a/INDIA_VDR_SEPTEMBER_2026.docx
+++ b/INDIA_VDR_SEPTEMBER_2026.docx
@@ -126,6 +126,8 @@
           </w:tcPr>
           <w:p>
             <w:pPr>
+              <w:spacing w:after="0" w:line="240" w:lineRule="auto"/>
+              <w:jc w:val="center"/>
               <w:rPr>
                 <w:b/>
                 <w:bCs/>
@@ -180,6 +182,8 @@
           </w:tcPr>
           <w:p>
             <w:pPr>
+              <w:spacing w:after="0" w:line="240" w:lineRule="auto"/>
+              <w:jc w:val="center"/>
               <w:rPr>
                 <w:b/>
                 <w:bCs/>
@@ -234,6 +238,8 @@
           </w:tcPr>
           <w:p>
             <w:pPr>
+              <w:spacing w:after="0" w:line="240" w:lineRule="auto"/>
+              <w:jc w:val="center"/>
               <w:rPr>
                 <w:b/>
                 <w:bCs/>
@@ -287,6 +293,8 @@
           </w:tcPr>
           <w:p>
             <w:pPr>
+              <w:spacing w:after="0" w:line="240" w:lineRule="auto"/>
+              <w:jc w:val="center"/>
               <w:rPr>
                 <w:b/>
                 <w:bCs/>
@@ -340,6 +348,8 @@
           </w:tcPr>
           <w:p>
             <w:pPr>
+              <w:spacing w:after="0" w:line="240" w:lineRule="auto"/>
+              <w:jc w:val="center"/>
               <w:rPr>
                 <w:b/>
                 <w:bCs/>

</xml_diff>